<commit_message>
Update LocalSampark application with recent features and enhancements
</commit_message>
<xml_diff>
--- a/Implement Plan/Last Update.docx
+++ b/Implement Plan/Last Update.docx
@@ -274,6 +274,14 @@
     <w:p/>
     <w:p/>
     <w:p>
+      <w:pPr>
+        <w:rPr>
+          <w:rFonts w:ascii="Segoe UI" w:hAnsi="Segoe UI" w:cs="Segoe UI"/>
+          <w:color w:val="CCCCCC"/>
+          <w:sz w:val="20"/>
+          <w:szCs w:val="20"/>
+        </w:rPr>
+      </w:pPr>
       <w:r>
         <w:rPr>
           <w:rFonts w:ascii="Segoe UI" w:hAnsi="Segoe UI" w:cs="Segoe UI"/>
@@ -703,6 +711,217 @@
           <w:szCs w:val="20"/>
         </w:rPr>
         <w:t xml:space="preserve"> Create a complete Detailed Comprehensive Implementation Plan For The Required Changes.</w:t>
+      </w:r>
+    </w:p>
+    <w:p>
+      <w:pPr>
+        <w:rPr>
+          <w:rFonts w:ascii="Segoe UI" w:hAnsi="Segoe UI" w:cs="Segoe UI"/>
+          <w:color w:val="CCCCCC"/>
+          <w:sz w:val="20"/>
+          <w:szCs w:val="20"/>
+        </w:rPr>
+      </w:pPr>
+    </w:p>
+    <w:p>
+      <w:pPr>
+        <w:rPr>
+          <w:rFonts w:ascii="Segoe UI" w:hAnsi="Segoe UI" w:cs="Segoe UI"/>
+          <w:color w:val="CCCCCC"/>
+          <w:sz w:val="20"/>
+          <w:szCs w:val="20"/>
+        </w:rPr>
+      </w:pPr>
+    </w:p>
+    <w:p>
+      <w:pPr>
+        <w:rPr>
+          <w:rFonts w:ascii="Segoe UI" w:hAnsi="Segoe UI" w:cs="Segoe UI"/>
+          <w:color w:val="CCCCCC"/>
+          <w:sz w:val="20"/>
+          <w:szCs w:val="20"/>
+        </w:rPr>
+      </w:pPr>
+    </w:p>
+    <w:p>
+      <w:pPr>
+        <w:rPr>
+          <w:rFonts w:ascii="Segoe UI" w:hAnsi="Segoe UI" w:cs="Segoe UI"/>
+          <w:color w:val="CCCCCC"/>
+          <w:sz w:val="20"/>
+          <w:szCs w:val="20"/>
+        </w:rPr>
+      </w:pPr>
+    </w:p>
+    <w:p>
+      <w:r>
+        <w:t xml:space="preserve">what all upgrades Relate To Ui/UX Of Both Website and Mobile app Can Be Done In This </w:t>
+      </w:r>
+      <w:proofErr w:type="spellStart"/>
+      <w:r>
+        <w:t>Aplication,The</w:t>
+      </w:r>
+      <w:proofErr w:type="spellEnd"/>
+      <w:r>
+        <w:t xml:space="preserve"> Current Ui / </w:t>
+      </w:r>
+      <w:proofErr w:type="spellStart"/>
+      <w:r>
+        <w:t>Ux</w:t>
+      </w:r>
+      <w:proofErr w:type="spellEnd"/>
+      <w:r>
+        <w:t xml:space="preserve"> Of Website and Android App look Very </w:t>
+      </w:r>
+      <w:proofErr w:type="spellStart"/>
+      <w:r>
+        <w:t>Simple.i</w:t>
+      </w:r>
+      <w:proofErr w:type="spellEnd"/>
+      <w:r>
+        <w:t xml:space="preserve"> want to Completely Transform The Ui/ UX Of Both To Modern and advanced. Also The icon Which are used in Website and Android App look Very Basic </w:t>
+      </w:r>
+      <w:proofErr w:type="spellStart"/>
+      <w:r>
+        <w:t>i</w:t>
+      </w:r>
+      <w:proofErr w:type="spellEnd"/>
+      <w:r>
+        <w:t xml:space="preserve"> want To Change Complete look Of Website and Android App, It Should look </w:t>
+      </w:r>
+      <w:proofErr w:type="spellStart"/>
+      <w:r>
+        <w:t>proffesional,Colourfull</w:t>
+      </w:r>
+      <w:proofErr w:type="spellEnd"/>
+      <w:r>
+        <w:t xml:space="preserve"> ,Attractive Website And Android App. The Ui/ UX Design Of Complete Website Should Be As per Indian Ecommerce </w:t>
+      </w:r>
+      <w:proofErr w:type="spellStart"/>
+      <w:r>
+        <w:t>Market.i</w:t>
+      </w:r>
+      <w:proofErr w:type="spellEnd"/>
+      <w:r>
+        <w:t xml:space="preserve"> want the Best Ui/UX That All the Ecommerce Website Competitor.</w:t>
+      </w:r>
+    </w:p>
+    <w:p/>
+    <w:p/>
+    <w:p/>
+    <w:p>
+      <w:proofErr w:type="spellStart"/>
+      <w:r>
+        <w:t>i</w:t>
+      </w:r>
+      <w:proofErr w:type="spellEnd"/>
+      <w:r>
+        <w:t xml:space="preserve"> want You To Check And improve the Complete Overall performance of the website and mobile android </w:t>
+      </w:r>
+      <w:proofErr w:type="spellStart"/>
+      <w:r>
+        <w:t>app,currently</w:t>
+      </w:r>
+      <w:proofErr w:type="spellEnd"/>
+      <w:r>
+        <w:t xml:space="preserve"> </w:t>
+      </w:r>
+      <w:proofErr w:type="spellStart"/>
+      <w:r>
+        <w:t>its</w:t>
+      </w:r>
+      <w:proofErr w:type="spellEnd"/>
+      <w:r>
+        <w:t xml:space="preserve"> too Slow and it takes time to Load different Section Different </w:t>
+      </w:r>
+      <w:proofErr w:type="spellStart"/>
+      <w:r>
+        <w:t>pages,i</w:t>
+      </w:r>
+      <w:proofErr w:type="spellEnd"/>
+      <w:r>
+        <w:t xml:space="preserve"> want You To </w:t>
+      </w:r>
+      <w:proofErr w:type="spellStart"/>
+      <w:r>
+        <w:t>To</w:t>
+      </w:r>
+      <w:proofErr w:type="spellEnd"/>
+      <w:r>
+        <w:t xml:space="preserve"> Do </w:t>
+      </w:r>
+      <w:proofErr w:type="spellStart"/>
+      <w:r>
+        <w:t>ComPlete</w:t>
+      </w:r>
+      <w:proofErr w:type="spellEnd"/>
+      <w:r>
+        <w:t xml:space="preserve"> Recheck Audit Of Complete Application For Performance </w:t>
+      </w:r>
+      <w:proofErr w:type="spellStart"/>
+      <w:r>
+        <w:t>boost,Application</w:t>
+      </w:r>
+      <w:proofErr w:type="spellEnd"/>
+      <w:r>
+        <w:t xml:space="preserve"> and website Should Work Smooth Even if There are Large Number Of items To load In Different Section. Do A 10 Times Deeper Think And help Me To Improve All performance related Issues</w:t>
+      </w:r>
+    </w:p>
+    <w:p/>
+    <w:p/>
+    <w:p>
+      <w:r>
+        <w:t xml:space="preserve">do a complete deep </w:t>
+      </w:r>
+      <w:proofErr w:type="spellStart"/>
+      <w:r>
+        <w:t>analysed</w:t>
+      </w:r>
+      <w:proofErr w:type="spellEnd"/>
+      <w:r>
+        <w:t xml:space="preserve"> recheck audit of all completed Code base Of The Application and fix all the pending and missing things ,Do a Complete </w:t>
+      </w:r>
+      <w:proofErr w:type="spellStart"/>
+      <w:r>
+        <w:t>Debuging</w:t>
+      </w:r>
+      <w:proofErr w:type="spellEnd"/>
+      <w:r>
+        <w:t xml:space="preserve"> Of Complete Application And fix all the issues of application. Do a 10 times deeper recheck audit and complete all pending things.                 </w:t>
+      </w:r>
+    </w:p>
+    <w:p/>
+    <w:p/>
+    <w:p>
+      <w:r>
+        <w:t xml:space="preserve">the final build of </w:t>
+      </w:r>
+      <w:proofErr w:type="spellStart"/>
+      <w:r>
+        <w:t>apk</w:t>
+      </w:r>
+      <w:proofErr w:type="spellEnd"/>
+      <w:r>
+        <w:t xml:space="preserve"> when installed in mobile The Application Is Not Able To Run And It Gives White Out Screen on Mobile App. Do a 10 Times Deeper Recheck Audit Of Complete Mobile Application Final </w:t>
+      </w:r>
+      <w:proofErr w:type="spellStart"/>
+      <w:r>
+        <w:t>Apk</w:t>
+      </w:r>
+      <w:proofErr w:type="spellEnd"/>
+      <w:r>
+        <w:t xml:space="preserve"> ,Mobile Android application is not able to work </w:t>
+      </w:r>
+      <w:proofErr w:type="spellStart"/>
+      <w:r>
+        <w:t>Properly.And</w:t>
+      </w:r>
+      <w:proofErr w:type="spellEnd"/>
+      <w:r>
+        <w:t xml:space="preserve"> Fix All The Issues Of the Android Application Startup.</w:t>
+      </w:r>
+      <w:r>
+        <w:t xml:space="preserve">                                 </w:t>
       </w:r>
     </w:p>
     <w:sectPr>

</xml_diff>

<commit_message>
Update application code, modules, and components
</commit_message>
<xml_diff>
--- a/Implement Plan/Last Update.docx
+++ b/Implement Plan/Last Update.docx
@@ -91,7 +91,15 @@
       </w:r>
       <w:proofErr w:type="spellEnd"/>
       <w:r>
-        <w:t xml:space="preserve"> want Do a Complete  Deep </w:t>
+        <w:t xml:space="preserve"> want Do a </w:t>
+      </w:r>
+      <w:proofErr w:type="gramStart"/>
+      <w:r>
+        <w:t>Complete  Deep</w:t>
+      </w:r>
+      <w:proofErr w:type="gramEnd"/>
+      <w:r>
+        <w:t xml:space="preserve"> </w:t>
       </w:r>
       <w:proofErr w:type="spellStart"/>
       <w:r>
@@ -134,10 +142,12 @@
         <w:t xml:space="preserve"> want To Fix All the Errors Of </w:t>
       </w:r>
       <w:proofErr w:type="spellStart"/>
+      <w:proofErr w:type="gramStart"/>
       <w:r>
         <w:t>Application,Also</w:t>
       </w:r>
       <w:proofErr w:type="spellEnd"/>
+      <w:proofErr w:type="gramEnd"/>
       <w:r>
         <w:t xml:space="preserve"> </w:t>
       </w:r>
@@ -171,7 +181,15 @@
       </w:r>
       <w:proofErr w:type="spellEnd"/>
       <w:r>
-        <w:t xml:space="preserve"> Want To make This Complete Application production  Ready. with All More Advanced Feature, Also Check For Attached image In Want You To Also Do Complete Check Of Admin panel God mode That All The Features And option </w:t>
+        <w:t xml:space="preserve"> Want To make This Complete Application production  Ready. with All More Advanced Feature, Also Check </w:t>
+      </w:r>
+      <w:proofErr w:type="gramStart"/>
+      <w:r>
+        <w:t>For</w:t>
+      </w:r>
+      <w:proofErr w:type="gramEnd"/>
+      <w:r>
+        <w:t xml:space="preserve"> Attached image In Want You To Also Do Complete Check Of Admin panel God mode That All The Features And option </w:t>
       </w:r>
       <w:proofErr w:type="spellStart"/>
       <w:r>
@@ -195,7 +213,15 @@
       </w:r>
       <w:proofErr w:type="spellEnd"/>
       <w:r>
-        <w:t xml:space="preserve">. Do A Complete 10 Times Deeper Audit Recheck Of Complete Application And Fix All The issues. Create a Complete Deep </w:t>
+        <w:t xml:space="preserve">. Do A Complete 10 Times Deeper Audit Recheck </w:t>
+      </w:r>
+      <w:proofErr w:type="gramStart"/>
+      <w:r>
+        <w:t>Of</w:t>
+      </w:r>
+      <w:proofErr w:type="gramEnd"/>
+      <w:r>
+        <w:t xml:space="preserve"> Complete Application And Fix All The issues. Create a Complete Deep </w:t>
       </w:r>
       <w:proofErr w:type="spellStart"/>
       <w:r>
@@ -203,18 +229,28 @@
       </w:r>
       <w:proofErr w:type="spellEnd"/>
       <w:r>
-        <w:t xml:space="preserve"> Comprehensive Detailed plan To Fix All The issues.</w:t>
-      </w:r>
-    </w:p>
-    <w:p/>
-    <w:p/>
-    <w:p/>
-    <w:p>
-      <w:proofErr w:type="spellStart"/>
+        <w:t xml:space="preserve"> Comprehensive Detailed </w:t>
+      </w:r>
+      <w:proofErr w:type="gramStart"/>
+      <w:r>
+        <w:t>plan</w:t>
+      </w:r>
+      <w:proofErr w:type="gramEnd"/>
+      <w:r>
+        <w:t xml:space="preserve"> To Fix All The issues.</w:t>
+      </w:r>
+    </w:p>
+    <w:p/>
+    <w:p/>
+    <w:p/>
+    <w:p>
+      <w:proofErr w:type="spellStart"/>
+      <w:proofErr w:type="gramStart"/>
       <w:r>
         <w:t>Approved,i</w:t>
       </w:r>
       <w:proofErr w:type="spellEnd"/>
+      <w:proofErr w:type="gramEnd"/>
       <w:r>
         <w:t xml:space="preserve"> want You To Start The Implementation as per updated </w:t>
       </w:r>
@@ -254,7 +290,6 @@
     </w:p>
     <w:p/>
     <w:p/>
-    <w:p/>
     <w:p>
       <w:r>
         <w:t xml:space="preserve">do a complete deep </w:t>
@@ -265,10 +300,59 @@
       </w:r>
       <w:proofErr w:type="spellEnd"/>
       <w:r>
-        <w:t xml:space="preserve"> recheck audit of all completed phases and fix all the pending and missing things then will start with next phase, Do a 10 times deeper recheck audit and complete all pending things.</w:t>
-      </w:r>
-      <w:r>
-        <w:t xml:space="preserve">                                                  </w:t>
+        <w:t xml:space="preserve"> recheck audit of all completed phases and fix all the pending and missing things then will start with next phase, </w:t>
+      </w:r>
+      <w:proofErr w:type="gramStart"/>
+      <w:r>
+        <w:t>Do</w:t>
+      </w:r>
+      <w:proofErr w:type="gramEnd"/>
+      <w:r>
+        <w:t xml:space="preserve"> a 10 times deeper recheck audit and complete all pending things.</w:t>
+      </w:r>
+      <w:r>
+        <w:t xml:space="preserve">                  </w:t>
+      </w:r>
+    </w:p>
+    <w:p/>
+    <w:p/>
+    <w:p>
+      <w:proofErr w:type="spellStart"/>
+      <w:r>
+        <w:t>plz</w:t>
+      </w:r>
+      <w:proofErr w:type="spellEnd"/>
+      <w:r>
+        <w:t xml:space="preserve"> check the attached image of error comes and application Crashes When last build Of Android application was installed in </w:t>
+      </w:r>
+      <w:proofErr w:type="spellStart"/>
+      <w:proofErr w:type="gramStart"/>
+      <w:r>
+        <w:t>mobile,Do</w:t>
+      </w:r>
+      <w:proofErr w:type="spellEnd"/>
+      <w:proofErr w:type="gramEnd"/>
+      <w:r>
+        <w:t xml:space="preserve"> a 10 Times Deeper </w:t>
+      </w:r>
+      <w:proofErr w:type="spellStart"/>
+      <w:r>
+        <w:t>Rechek</w:t>
+      </w:r>
+      <w:proofErr w:type="spellEnd"/>
+      <w:r>
+        <w:t xml:space="preserve"> Audit Of Complete Production Of Android Application From Start To End And </w:t>
+      </w:r>
+      <w:proofErr w:type="spellStart"/>
+      <w:r>
+        <w:t>Fixz</w:t>
+      </w:r>
+      <w:proofErr w:type="spellEnd"/>
+      <w:r>
+        <w:t xml:space="preserve"> all The issues Of Final Build.</w:t>
+      </w:r>
+      <w:r>
+        <w:t xml:space="preserve">                                </w:t>
       </w:r>
     </w:p>
     <w:p/>
@@ -289,7 +373,6 @@
           <w:sz w:val="20"/>
           <w:szCs w:val="20"/>
         </w:rPr>
-        <w:lastRenderedPageBreak/>
         <w:t xml:space="preserve">my current web App And Mobile Android application Is An Ecommerce System Model ,were My Ambitious is To Connect all Local </w:t>
       </w:r>
       <w:proofErr w:type="spellStart"/>
@@ -734,34 +817,16 @@
       </w:pPr>
     </w:p>
     <w:p>
-      <w:pPr>
-        <w:rPr>
-          <w:rFonts w:ascii="Segoe UI" w:hAnsi="Segoe UI" w:cs="Segoe UI"/>
-          <w:color w:val="CCCCCC"/>
-          <w:sz w:val="20"/>
-          <w:szCs w:val="20"/>
-        </w:rPr>
-      </w:pPr>
-    </w:p>
-    <w:p>
-      <w:pPr>
-        <w:rPr>
-          <w:rFonts w:ascii="Segoe UI" w:hAnsi="Segoe UI" w:cs="Segoe UI"/>
-          <w:color w:val="CCCCCC"/>
-          <w:sz w:val="20"/>
-          <w:szCs w:val="20"/>
-        </w:rPr>
-      </w:pPr>
-    </w:p>
-    <w:p>
       <w:r>
         <w:t xml:space="preserve">what all upgrades Relate To Ui/UX Of Both Website and Mobile app Can Be Done In This </w:t>
       </w:r>
       <w:proofErr w:type="spellStart"/>
+      <w:proofErr w:type="gramStart"/>
       <w:r>
         <w:t>Aplication,The</w:t>
       </w:r>
       <w:proofErr w:type="spellEnd"/>
+      <w:proofErr w:type="gramEnd"/>
       <w:r>
         <w:t xml:space="preserve"> Current Ui / </w:t>
       </w:r>
@@ -790,12 +855,22 @@
         <w:t xml:space="preserve"> want To Change Complete look Of Website and Android App, It Should look </w:t>
       </w:r>
       <w:proofErr w:type="spellStart"/>
+      <w:proofErr w:type="gramStart"/>
       <w:r>
         <w:t>proffesional,Colourfull</w:t>
       </w:r>
       <w:proofErr w:type="spellEnd"/>
-      <w:r>
-        <w:t xml:space="preserve"> ,Attractive Website And Android App. The Ui/ UX Design Of Complete Website Should Be As per Indian Ecommerce </w:t>
+      <w:proofErr w:type="gramEnd"/>
+      <w:r>
+        <w:t xml:space="preserve"> ,Attractive Website And Android App. The Ui/ UX Design </w:t>
+      </w:r>
+      <w:proofErr w:type="gramStart"/>
+      <w:r>
+        <w:t>Of</w:t>
+      </w:r>
+      <w:proofErr w:type="gramEnd"/>
+      <w:r>
+        <w:t xml:space="preserve"> Complete Website Should Be As per Indian Ecommerce </w:t>
       </w:r>
       <w:proofErr w:type="spellStart"/>
       <w:r>
@@ -807,8 +882,6 @@
       </w:r>
     </w:p>
     <w:p/>
-    <w:p/>
-    <w:p/>
     <w:p>
       <w:proofErr w:type="spellStart"/>
       <w:r>
@@ -819,10 +892,12 @@
         <w:t xml:space="preserve"> want You To Check And improve the Complete Overall performance of the website and mobile android </w:t>
       </w:r>
       <w:proofErr w:type="spellStart"/>
+      <w:proofErr w:type="gramStart"/>
       <w:r>
         <w:t>app,currently</w:t>
       </w:r>
       <w:proofErr w:type="spellEnd"/>
+      <w:proofErr w:type="gramEnd"/>
       <w:r>
         <w:t xml:space="preserve"> </w:t>
       </w:r>
@@ -864,10 +939,17 @@
       </w:r>
       <w:proofErr w:type="spellEnd"/>
       <w:r>
-        <w:t xml:space="preserve"> and website Should Work Smooth Even if There are Large Number Of items To load In Different Section. Do A 10 Times Deeper Think And help Me To Improve All performance related Issues</w:t>
-      </w:r>
-    </w:p>
-    <w:p/>
+        <w:t xml:space="preserve"> and website Should Work Smooth Even if There are Large Number Of items To load In Different Section. Do A 10 Times Deeper Think And help Me </w:t>
+      </w:r>
+      <w:proofErr w:type="gramStart"/>
+      <w:r>
+        <w:t>To</w:t>
+      </w:r>
+      <w:proofErr w:type="gramEnd"/>
+      <w:r>
+        <w:t xml:space="preserve"> Improve All performance related Issues</w:t>
+      </w:r>
+    </w:p>
     <w:p/>
     <w:p>
       <w:r>
@@ -879,7 +961,15 @@
       </w:r>
       <w:proofErr w:type="spellEnd"/>
       <w:r>
-        <w:t xml:space="preserve"> recheck audit of all completed Code base Of The Application and fix all the pending and missing things ,Do a Complete </w:t>
+        <w:t xml:space="preserve"> recheck audit of all completed Code base Of The Application and fix all the pending and missing </w:t>
+      </w:r>
+      <w:proofErr w:type="gramStart"/>
+      <w:r>
+        <w:t>things ,Do</w:t>
+      </w:r>
+      <w:proofErr w:type="gramEnd"/>
+      <w:r>
+        <w:t xml:space="preserve"> a Complete </w:t>
       </w:r>
       <w:proofErr w:type="spellStart"/>
       <w:r>
@@ -887,13 +977,110 @@
       </w:r>
       <w:proofErr w:type="spellEnd"/>
       <w:r>
-        <w:t xml:space="preserve"> Of Complete Application And fix all the issues of application. Do a 10 times deeper recheck audit and complete all pending things.                 </w:t>
-      </w:r>
-    </w:p>
-    <w:p/>
-    <w:p/>
-    <w:p>
-      <w:r>
+        <w:t xml:space="preserve"> Of Complete Application And fix all the issues of application. Do </w:t>
+      </w:r>
+      <w:proofErr w:type="gramStart"/>
+      <w:r>
+        <w:t>a 10 times</w:t>
+      </w:r>
+      <w:proofErr w:type="gramEnd"/>
+      <w:r>
+        <w:t xml:space="preserve"> deeper recheck audit and complete all pending things.                 </w:t>
+      </w:r>
+    </w:p>
+    <w:p/>
+    <w:p>
+      <w:pPr>
+        <w:rPr>
+          <w:rFonts w:cstheme="minorHAnsi"/>
+          <w:b/>
+          <w:bCs/>
+          <w:sz w:val="24"/>
+          <w:szCs w:val="24"/>
+        </w:rPr>
+      </w:pPr>
+      <w:proofErr w:type="spellStart"/>
+      <w:r>
+        <w:rPr>
+          <w:rFonts w:cstheme="minorHAnsi"/>
+          <w:b/>
+          <w:bCs/>
+          <w:sz w:val="24"/>
+          <w:szCs w:val="24"/>
+        </w:rPr>
+        <w:t>whats</w:t>
+      </w:r>
+      <w:proofErr w:type="spellEnd"/>
+      <w:r>
+        <w:rPr>
+          <w:rFonts w:cstheme="minorHAnsi"/>
+          <w:b/>
+          <w:bCs/>
+          <w:sz w:val="24"/>
+          <w:szCs w:val="24"/>
+        </w:rPr>
+        <w:t xml:space="preserve"> the current </w:t>
+      </w:r>
+      <w:proofErr w:type="spellStart"/>
+      <w:r>
+        <w:rPr>
+          <w:rFonts w:cstheme="minorHAnsi"/>
+          <w:b/>
+          <w:bCs/>
+          <w:sz w:val="24"/>
+          <w:szCs w:val="24"/>
+        </w:rPr>
+        <w:t>ststus</w:t>
+      </w:r>
+      <w:proofErr w:type="spellEnd"/>
+      <w:r>
+        <w:rPr>
+          <w:rFonts w:cstheme="minorHAnsi"/>
+          <w:b/>
+          <w:bCs/>
+          <w:sz w:val="24"/>
+          <w:szCs w:val="24"/>
+        </w:rPr>
+        <w:t xml:space="preserve"> of build, </w:t>
+      </w:r>
+      <w:proofErr w:type="gramStart"/>
+      <w:r>
+        <w:rPr>
+          <w:rFonts w:cstheme="minorHAnsi"/>
+          <w:b/>
+          <w:bCs/>
+          <w:sz w:val="24"/>
+          <w:szCs w:val="24"/>
+        </w:rPr>
+        <w:t>How</w:t>
+      </w:r>
+      <w:proofErr w:type="gramEnd"/>
+      <w:r>
+        <w:rPr>
+          <w:rFonts w:cstheme="minorHAnsi"/>
+          <w:b/>
+          <w:bCs/>
+          <w:sz w:val="24"/>
+          <w:szCs w:val="24"/>
+        </w:rPr>
+        <w:t xml:space="preserve"> much time it will take more for Final build of </w:t>
+      </w:r>
+      <w:proofErr w:type="spellStart"/>
+      <w:r>
+        <w:rPr>
+          <w:rFonts w:cstheme="minorHAnsi"/>
+          <w:b/>
+          <w:bCs/>
+          <w:sz w:val="24"/>
+          <w:szCs w:val="24"/>
+        </w:rPr>
+        <w:t>apk</w:t>
+      </w:r>
+      <w:proofErr w:type="spellEnd"/>
+    </w:p>
+    <w:p>
+      <w:r>
+        <w:lastRenderedPageBreak/>
         <w:t xml:space="preserve">the final build of </w:t>
       </w:r>
       <w:proofErr w:type="spellStart"/>
@@ -902,15 +1089,28 @@
       </w:r>
       <w:proofErr w:type="spellEnd"/>
       <w:r>
-        <w:t xml:space="preserve"> when installed in mobile The Application Is Not Able To Run And It Gives White Out Screen on Mobile App. Do a 10 Times Deeper Recheck Audit Of Complete Mobile Application Final </w:t>
-      </w:r>
-      <w:proofErr w:type="spellStart"/>
+        <w:t xml:space="preserve"> when installed in mobile The Application Is Not Able </w:t>
+      </w:r>
+      <w:proofErr w:type="gramStart"/>
+      <w:r>
+        <w:t>To</w:t>
+      </w:r>
+      <w:proofErr w:type="gramEnd"/>
+      <w:r>
+        <w:t xml:space="preserve"> Run And It Gives White Out Screen on Mobile App. Do a 10 Times Deeper Recheck Audit Of Complete Mobile Application Final </w:t>
+      </w:r>
+      <w:proofErr w:type="spellStart"/>
+      <w:proofErr w:type="gramStart"/>
       <w:r>
         <w:t>Apk</w:t>
       </w:r>
       <w:proofErr w:type="spellEnd"/>
       <w:r>
-        <w:t xml:space="preserve"> ,Mobile Android application is not able to work </w:t>
+        <w:t xml:space="preserve"> ,Mobile</w:t>
+      </w:r>
+      <w:proofErr w:type="gramEnd"/>
+      <w:r>
+        <w:t xml:space="preserve"> Android application is not able to work </w:t>
       </w:r>
       <w:proofErr w:type="spellStart"/>
       <w:r>
@@ -921,7 +1121,2575 @@
         <w:t xml:space="preserve"> Fix All The Issues Of the Android Application Startup.</w:t>
       </w:r>
       <w:r>
-        <w:t xml:space="preserve">                                 </w:t>
+        <w:t xml:space="preserve">          </w:t>
+      </w:r>
+    </w:p>
+    <w:p/>
+    <w:p/>
+    <w:p>
+      <w:r>
+        <w:t xml:space="preserve">Still Its Same White Screen Stuck issue is still Not Resolved After last </w:t>
+      </w:r>
+      <w:proofErr w:type="spellStart"/>
+      <w:proofErr w:type="gramStart"/>
+      <w:r>
+        <w:t>implementation,i</w:t>
+      </w:r>
+      <w:proofErr w:type="spellEnd"/>
+      <w:proofErr w:type="gramEnd"/>
+      <w:r>
+        <w:t xml:space="preserve"> have created New build after update still White screen Stuck issue </w:t>
+      </w:r>
+      <w:proofErr w:type="spellStart"/>
+      <w:r>
+        <w:t>persists.My</w:t>
+      </w:r>
+      <w:proofErr w:type="spellEnd"/>
+      <w:r>
+        <w:t xml:space="preserve"> last 8 To 10 build Of Android All </w:t>
+      </w:r>
+      <w:proofErr w:type="spellStart"/>
+      <w:r>
+        <w:t>Didnt</w:t>
+      </w:r>
+      <w:proofErr w:type="spellEnd"/>
+      <w:r>
+        <w:t xml:space="preserve"> Run Properly they Were </w:t>
+      </w:r>
+      <w:proofErr w:type="spellStart"/>
+      <w:r>
+        <w:t>gving</w:t>
+      </w:r>
+      <w:proofErr w:type="spellEnd"/>
+      <w:r>
+        <w:t xml:space="preserve"> White Screen Stuck issue On Startup only When app is installed in </w:t>
+      </w:r>
+      <w:proofErr w:type="spellStart"/>
+      <w:r>
+        <w:t>mobile.Do</w:t>
+      </w:r>
+      <w:proofErr w:type="spellEnd"/>
+      <w:r>
+        <w:t xml:space="preserve"> a 10 times deeper Recheck Audit of mobile application and fix all the issues of application and make it run working Properly </w:t>
+      </w:r>
+      <w:proofErr w:type="spellStart"/>
+      <w:r>
+        <w:t>With out</w:t>
+      </w:r>
+      <w:proofErr w:type="spellEnd"/>
+      <w:r>
+        <w:t xml:space="preserve"> </w:t>
+      </w:r>
+      <w:proofErr w:type="spellStart"/>
+      <w:r>
+        <w:t>stucking</w:t>
+      </w:r>
+      <w:proofErr w:type="spellEnd"/>
+      <w:r>
+        <w:t xml:space="preserve"> at startup.</w:t>
+      </w:r>
+      <w:r>
+        <w:t xml:space="preserve">             </w:t>
+      </w:r>
+    </w:p>
+    <w:p/>
+    <w:p/>
+    <w:p>
+      <w:r>
+        <w:t xml:space="preserve">Still Its Same White Screen Stuck issue is still Not Resolved After last </w:t>
+      </w:r>
+      <w:proofErr w:type="spellStart"/>
+      <w:proofErr w:type="gramStart"/>
+      <w:r>
+        <w:t>implementation,i</w:t>
+      </w:r>
+      <w:proofErr w:type="spellEnd"/>
+      <w:proofErr w:type="gramEnd"/>
+      <w:r>
+        <w:t xml:space="preserve"> have created New build after update still White screen Stuck issue </w:t>
+      </w:r>
+      <w:proofErr w:type="spellStart"/>
+      <w:r>
+        <w:t>persists.My</w:t>
+      </w:r>
+      <w:proofErr w:type="spellEnd"/>
+      <w:r>
+        <w:t xml:space="preserve"> last 8 To 10 build Of Android All </w:t>
+      </w:r>
+      <w:proofErr w:type="spellStart"/>
+      <w:r>
+        <w:t>Didnt</w:t>
+      </w:r>
+      <w:proofErr w:type="spellEnd"/>
+      <w:r>
+        <w:t xml:space="preserve"> Run Properly they Were </w:t>
+      </w:r>
+      <w:proofErr w:type="spellStart"/>
+      <w:r>
+        <w:t>gving</w:t>
+      </w:r>
+      <w:proofErr w:type="spellEnd"/>
+      <w:r>
+        <w:t xml:space="preserve"> White Screen Stuck issue On Startup only When app is installed in </w:t>
+      </w:r>
+      <w:proofErr w:type="spellStart"/>
+      <w:r>
+        <w:t>mobile.Do</w:t>
+      </w:r>
+      <w:proofErr w:type="spellEnd"/>
+      <w:r>
+        <w:t xml:space="preserve"> a 10 times deeper Recheck Audit of mobile application and fix all the issues of application and make it run working Properly </w:t>
+      </w:r>
+      <w:proofErr w:type="spellStart"/>
+      <w:r>
+        <w:t>With out</w:t>
+      </w:r>
+      <w:proofErr w:type="spellEnd"/>
+      <w:r>
+        <w:t xml:space="preserve"> </w:t>
+      </w:r>
+      <w:proofErr w:type="spellStart"/>
+      <w:r>
+        <w:t>stucking</w:t>
+      </w:r>
+      <w:proofErr w:type="spellEnd"/>
+      <w:r>
+        <w:t xml:space="preserve"> at startup. Do a Very Deep Research </w:t>
+      </w:r>
+      <w:proofErr w:type="gramStart"/>
+      <w:r>
+        <w:t>On</w:t>
+      </w:r>
+      <w:proofErr w:type="gramEnd"/>
+      <w:r>
+        <w:t xml:space="preserve"> Complete Issue and Give a Complete and proper fix that after fix next build of </w:t>
+      </w:r>
+      <w:proofErr w:type="spellStart"/>
+      <w:r>
+        <w:t>apk</w:t>
+      </w:r>
+      <w:proofErr w:type="spellEnd"/>
+      <w:r>
+        <w:t xml:space="preserve"> will Run Properly         </w:t>
+      </w:r>
+    </w:p>
+    <w:p/>
+    <w:p/>
+    <w:p>
+      <w:r>
+        <w:t xml:space="preserve">The Last Build </w:t>
+      </w:r>
+      <w:proofErr w:type="gramStart"/>
+      <w:r>
+        <w:t>Of</w:t>
+      </w:r>
+      <w:proofErr w:type="gramEnd"/>
+      <w:r>
+        <w:t xml:space="preserve"> Android application is Working When Installed In mobile application,</w:t>
+      </w:r>
+      <w:r>
+        <w:t xml:space="preserve"> </w:t>
+      </w:r>
+      <w:r>
+        <w:t>But still many features and funct</w:t>
+      </w:r>
+      <w:r>
+        <w:t>i</w:t>
+      </w:r>
+      <w:r>
+        <w:t>ons are not Working Pr</w:t>
+      </w:r>
+      <w:r>
+        <w:t>o</w:t>
+      </w:r>
+      <w:r>
+        <w:t xml:space="preserve">perly in the android Application. I want same like website exact all feature properly fully sync In Mobile android application. This Mobile Application Is Developed For </w:t>
+      </w:r>
+      <w:proofErr w:type="gramStart"/>
+      <w:r>
+        <w:t>same</w:t>
+      </w:r>
+      <w:proofErr w:type="gramEnd"/>
+      <w:r>
+        <w:t xml:space="preserve"> Website So That user can Have Access To Application From Both Website and mobile android app For Same Website and mobile app Same Database,</w:t>
+      </w:r>
+      <w:r>
+        <w:t xml:space="preserve"> </w:t>
+      </w:r>
+      <w:r>
+        <w:t xml:space="preserve">this is a very Important That Android application Should Work Properly like Website, Can U Do 10 times deeper Recheck Audit Of All Android application and website Production Build of Android </w:t>
+      </w:r>
+      <w:proofErr w:type="spellStart"/>
+      <w:r>
+        <w:t>Apk</w:t>
+      </w:r>
+      <w:proofErr w:type="spellEnd"/>
+      <w:r>
+        <w:t xml:space="preserve"> And Fix All the issues From the Android Build Production of Application</w:t>
+      </w:r>
+    </w:p>
+    <w:p/>
+    <w:p/>
+    <w:p/>
+    <w:p/>
+    <w:p/>
+    <w:p/>
+    <w:p>
+      <w:r>
+        <w:lastRenderedPageBreak/>
+        <w:t xml:space="preserve"># </w:t>
+      </w:r>
+      <w:r>
+        <w:rPr>
+          <w:rFonts w:ascii="Segoe UI Emoji" w:hAnsi="Segoe UI Emoji" w:cs="Segoe UI Emoji"/>
+        </w:rPr>
+        <w:t>🔬</w:t>
+      </w:r>
+      <w:r>
+        <w:t xml:space="preserve"> Deep 10x Audit &amp; Fix Plan: Android App ↔ Website Full Feature Parity</w:t>
+      </w:r>
+    </w:p>
+    <w:p/>
+    <w:p>
+      <w:r>
+        <w:t>## Problem Statement</w:t>
+      </w:r>
+    </w:p>
+    <w:p>
+      <w:r>
+        <w:t>The Android mobile app installs and runs, but many features don't work properly compared to the website. Both share the same backend API (`https://localsampark-api.onrender.com/</w:t>
+      </w:r>
+      <w:proofErr w:type="spellStart"/>
+      <w:r>
+        <w:t>api</w:t>
+      </w:r>
+      <w:proofErr w:type="spellEnd"/>
+      <w:r>
+        <w:t>/v1`) and database. The goal is to make ALL 73+ module screens work with real API data, while preserving a proper mock testing environment for development.</w:t>
+      </w:r>
+    </w:p>
+    <w:p/>
+    <w:p>
+      <w:r>
+        <w:t>---</w:t>
+      </w:r>
+    </w:p>
+    <w:p/>
+    <w:p>
+      <w:r>
+        <w:t>## Complete Module Audit Results</w:t>
+      </w:r>
+    </w:p>
+    <w:p/>
+    <w:p>
+      <w:r>
+        <w:t>I scanned every single `.</w:t>
+      </w:r>
+      <w:proofErr w:type="spellStart"/>
+      <w:r>
+        <w:t>js</w:t>
+      </w:r>
+      <w:proofErr w:type="spellEnd"/>
+      <w:r>
+        <w:t>` file across all 73+ modules to check if they use **real API calls** vs **hardcoded mock data**. Here are the results organized into 4 tiers:</w:t>
+      </w:r>
+    </w:p>
+    <w:p/>
+    <w:p>
+      <w:r>
+        <w:t xml:space="preserve">### </w:t>
+      </w:r>
+      <w:r>
+        <w:rPr>
+          <w:rFonts w:ascii="Segoe UI Emoji" w:hAnsi="Segoe UI Emoji" w:cs="Segoe UI Emoji"/>
+        </w:rPr>
+        <w:t>🔴</w:t>
+      </w:r>
+      <w:r>
+        <w:t xml:space="preserve"> Tier 1: COMPLETELY BROKEN — 100% Mock Data, Zero API Calls (14 screens)</w:t>
+      </w:r>
+    </w:p>
+    <w:p>
+      <w:r>
+        <w:t>These screens show fake hardcoded data and never contact the backend at all.</w:t>
+      </w:r>
+    </w:p>
+    <w:p/>
+    <w:p>
+      <w:r>
+        <w:t>| Module | File | Issue |</w:t>
+      </w:r>
+    </w:p>
+    <w:p>
+      <w:r>
+        <w:t>|--------|------|-------|</w:t>
+      </w:r>
+    </w:p>
+    <w:p>
+      <w:r>
+        <w:t>| `shop/[id]` | [shop/[id].</w:t>
+      </w:r>
+      <w:proofErr w:type="gramStart"/>
+      <w:r>
+        <w:t>js](</w:t>
+      </w:r>
+      <w:proofErr w:type="gramEnd"/>
+      <w:r>
+        <w:t>file:///e:/localsampark%2027-07-2026/localsampark%2027-07-2026/apps/mobile/app/modules/shop/%5Bid%5D.js) | Fake shop name "Sharma Grocery", fake products, wrong `</w:t>
+      </w:r>
+      <w:proofErr w:type="spellStart"/>
+      <w:r>
+        <w:t>addToCart</w:t>
+      </w:r>
+      <w:proofErr w:type="spellEnd"/>
+      <w:r>
+        <w:t>` signature, invisible text colors |</w:t>
+      </w:r>
+    </w:p>
+    <w:p>
+      <w:r>
+        <w:t>| `checkout` | [</w:t>
+      </w:r>
+      <w:proofErr w:type="gramStart"/>
+      <w:r>
+        <w:t>checkout/index.js](</w:t>
+      </w:r>
+      <w:proofErr w:type="gramEnd"/>
+      <w:r>
+        <w:t>file:///e:/localsampark%2027-07-2026/localsampark%2027-07-2026/apps/mobile/app/modules/checkout/index.js) | `</w:t>
+      </w:r>
+      <w:proofErr w:type="spellStart"/>
+      <w:r>
+        <w:t>cartTotal</w:t>
+      </w:r>
+      <w:proofErr w:type="spellEnd"/>
+      <w:r>
+        <w:t xml:space="preserve"> = 340` hardcoded, no cart store, fake payment with `</w:t>
+      </w:r>
+      <w:proofErr w:type="spellStart"/>
+      <w:r>
+        <w:t>setTimeout</w:t>
+      </w:r>
+      <w:proofErr w:type="spellEnd"/>
+      <w:r>
+        <w:t>` |</w:t>
+      </w:r>
+    </w:p>
+    <w:p>
+      <w:r>
+        <w:t>| `order-history` | order-history/index.js | 100% mock order list, no API |</w:t>
+      </w:r>
+    </w:p>
+    <w:p>
+      <w:r>
+        <w:t>| `pets` | pets/index.js | 100% mock pet listings |</w:t>
+      </w:r>
+    </w:p>
+    <w:p>
+      <w:r>
+        <w:t>| `pharmacy` | pharmacy/index.js | 100% mock pharmacy data |</w:t>
+      </w:r>
+    </w:p>
+    <w:p>
+      <w:r>
+        <w:t>| `promotions` | promotions/index.js | 100% mock promotions |</w:t>
+      </w:r>
+    </w:p>
+    <w:p>
+      <w:r>
+        <w:t>| `register-shop` | register-shop/index.js | Mock form, doesn't submit to API |</w:t>
+      </w:r>
+    </w:p>
+    <w:p>
+      <w:r>
+        <w:lastRenderedPageBreak/>
+        <w:t>| `service-booking` | service-booking/index.js | Mock booking flow |</w:t>
+      </w:r>
+    </w:p>
+    <w:p>
+      <w:r>
+        <w:t>| `service-booking/[id]` | service-booking/[id]/index.js | Mock booking detail |</w:t>
+      </w:r>
+    </w:p>
+    <w:p>
+      <w:r>
+        <w:t>| `service-detail` | service-detail/index.js | Mock service info |</w:t>
+      </w:r>
+    </w:p>
+    <w:p>
+      <w:r>
+        <w:t>| `shop-dashboard` | [</w:t>
+      </w:r>
+      <w:proofErr w:type="gramStart"/>
+      <w:r>
+        <w:t>shop-dashboard/index.js](</w:t>
+      </w:r>
+      <w:proofErr w:type="gramEnd"/>
+      <w:r>
+        <w:t>file:///e:/localsampark%2027-07-2026/localsampark%2027-07-2026/apps/mobile/app/modules/shop-dashboard/index.js) | Mock dashboard stats |</w:t>
+      </w:r>
+    </w:p>
+    <w:p>
+      <w:r>
+        <w:t>| `shops` | shops/index.js | Mock shop listing |</w:t>
+      </w:r>
+    </w:p>
+    <w:p>
+      <w:r>
+        <w:t>| `shops/[id]` | shops/[id]/index.js | Mock shop detail (duplicate of shop/[id]) |</w:t>
+      </w:r>
+    </w:p>
+    <w:p>
+      <w:r>
+        <w:t>| `subscriptions` | subscriptions/index.js | Mock subscription plans |</w:t>
+      </w:r>
+    </w:p>
+    <w:p>
+      <w:r>
+        <w:t>| `zone-selector` | zone-selector/index.js | Mock zone data |</w:t>
+      </w:r>
+    </w:p>
+    <w:p/>
+    <w:p>
+      <w:r>
+        <w:t>---</w:t>
+      </w:r>
+    </w:p>
+    <w:p/>
+    <w:p>
+      <w:r>
+        <w:t xml:space="preserve">### </w:t>
+      </w:r>
+      <w:r>
+        <w:rPr>
+          <w:rFonts w:ascii="Segoe UI Emoji" w:hAnsi="Segoe UI Emoji" w:cs="Segoe UI Emoji"/>
+        </w:rPr>
+        <w:t>🟡</w:t>
+      </w:r>
+      <w:r>
+        <w:t xml:space="preserve"> Tier 2: MIXED MODE — Has API Import </w:t>
+      </w:r>
+      <w:proofErr w:type="gramStart"/>
+      <w:r>
+        <w:t>But</w:t>
+      </w:r>
+      <w:proofErr w:type="gramEnd"/>
+      <w:r>
+        <w:t xml:space="preserve"> Also Mock Fallback (11 screens)</w:t>
+      </w:r>
+    </w:p>
+    <w:p>
+      <w:r>
+        <w:t>These screens attempt API calls but fall back to mock data on failure. Need to be upgraded so the API path is the **primary** path and mock is clearly labeled as demo.</w:t>
+      </w:r>
+    </w:p>
+    <w:p/>
+    <w:p>
+      <w:r>
+        <w:t>| Module | File | Issue |</w:t>
+      </w:r>
+    </w:p>
+    <w:p>
+      <w:r>
+        <w:t>|--------|------|-------|</w:t>
+      </w:r>
+    </w:p>
+    <w:p>
+      <w:r>
+        <w:t>| `marketplace` | marketplace/index.js | API + mock fallback |</w:t>
+      </w:r>
+    </w:p>
+    <w:p>
+      <w:r>
+        <w:t>| `medical` | medical/index.js | API + mock fallback |</w:t>
+      </w:r>
+    </w:p>
+    <w:p>
+      <w:r>
+        <w:t>| `properties` | properties/index.js | API + mock fallback |</w:t>
+      </w:r>
+    </w:p>
+    <w:p>
+      <w:r>
+        <w:t>| `scrap` | scrap/index.js | API + mock fallback |</w:t>
+      </w:r>
+    </w:p>
+    <w:p>
+      <w:r>
+        <w:t>| `service/[id]` | service/[id]/index.js | API + mock fallback |</w:t>
+      </w:r>
+    </w:p>
+    <w:p>
+      <w:r>
+        <w:t>| `service-dashboard` | service-dashboard/index.js | API + mock fallback |</w:t>
+      </w:r>
+    </w:p>
+    <w:p>
+      <w:r>
+        <w:t>| `services` | services/index.js | API + mock fallback |</w:t>
+      </w:r>
+    </w:p>
+    <w:p>
+      <w:r>
+        <w:t>| `</w:t>
+      </w:r>
+      <w:proofErr w:type="spellStart"/>
+      <w:r>
+        <w:t>sos</w:t>
+      </w:r>
+      <w:proofErr w:type="spellEnd"/>
+      <w:r>
+        <w:t xml:space="preserve">` | </w:t>
+      </w:r>
+      <w:proofErr w:type="spellStart"/>
+      <w:r>
+        <w:t>sos</w:t>
+      </w:r>
+      <w:proofErr w:type="spellEnd"/>
+      <w:r>
+        <w:t>/index.js | API + mock fallback |</w:t>
+      </w:r>
+    </w:p>
+    <w:p>
+      <w:r>
+        <w:t>| `</w:t>
+      </w:r>
+      <w:proofErr w:type="spellStart"/>
+      <w:r>
+        <w:t>townsquare</w:t>
+      </w:r>
+      <w:proofErr w:type="spellEnd"/>
+      <w:r>
+        <w:t xml:space="preserve">` | </w:t>
+      </w:r>
+      <w:proofErr w:type="spellStart"/>
+      <w:r>
+        <w:t>townsquare</w:t>
+      </w:r>
+      <w:proofErr w:type="spellEnd"/>
+      <w:r>
+        <w:t>/index.js | API + mock fallback |</w:t>
+      </w:r>
+    </w:p>
+    <w:p>
+      <w:r>
+        <w:t>| `volunteer` | volunteer/index.js | API + mock fallback |</w:t>
+      </w:r>
+    </w:p>
+    <w:p>
+      <w:r>
+        <w:lastRenderedPageBreak/>
+        <w:t>| `wallet` | [</w:t>
+      </w:r>
+      <w:proofErr w:type="gramStart"/>
+      <w:r>
+        <w:t>wallet/index.js](</w:t>
+      </w:r>
+      <w:proofErr w:type="gramEnd"/>
+      <w:r>
+        <w:t>file:///e:/localsampark%2027-07-2026/localsampark%2027-07-2026/apps/mobile/app/modules/wallet/index.js) | API + mock fallback |</w:t>
+      </w:r>
+    </w:p>
+    <w:p/>
+    <w:p>
+      <w:r>
+        <w:t>---</w:t>
+      </w:r>
+    </w:p>
+    <w:p/>
+    <w:p>
+      <w:r>
+        <w:t xml:space="preserve">### </w:t>
+      </w:r>
+      <w:r>
+        <w:rPr>
+          <w:rFonts w:ascii="Segoe UI Emoji" w:hAnsi="Segoe UI Emoji" w:cs="Segoe UI Emoji"/>
+        </w:rPr>
+        <w:t>🟢</w:t>
+      </w:r>
+      <w:r>
+        <w:t xml:space="preserve"> Tier 3: PROPERLY CONNECTED — Real API Calls (30+ screens)</w:t>
+      </w:r>
+    </w:p>
+    <w:p>
+      <w:r>
+        <w:t>These screens correctly use `</w:t>
+      </w:r>
+      <w:proofErr w:type="spellStart"/>
+      <w:r>
+        <w:t>apiGet</w:t>
+      </w:r>
+      <w:proofErr w:type="spellEnd"/>
+      <w:r>
+        <w:t>`/`</w:t>
+      </w:r>
+      <w:proofErr w:type="spellStart"/>
+      <w:r>
+        <w:t>apiPost</w:t>
+      </w:r>
+      <w:proofErr w:type="spellEnd"/>
+      <w:r>
+        <w:t>` and work with real backend data.</w:t>
+      </w:r>
+    </w:p>
+    <w:p/>
+    <w:p>
+      <w:r>
+        <w:t>`about`, `bills`, `blood-bank`, `care`, `carpool`, `chat`, `chef`, `community`, `community-hub`, `</w:t>
+      </w:r>
+      <w:proofErr w:type="spellStart"/>
+      <w:r>
+        <w:t>crm</w:t>
+      </w:r>
+      <w:proofErr w:type="spellEnd"/>
+      <w:r>
+        <w:t>`, `delivery`, `donations`, `earn`, `equipment`, `events`, `features`, `franchise`, `health`, `jobs`, `</w:t>
+      </w:r>
+      <w:proofErr w:type="spellStart"/>
+      <w:r>
+        <w:t>krishi</w:t>
+      </w:r>
+      <w:proofErr w:type="spellEnd"/>
+      <w:r>
+        <w:t>` (all sub-modules), `neighborhood`, `offline`, `profile`, `referral`, `rewards`, `shop-detail`, `shop-manager`, `society-registration`</w:t>
+      </w:r>
+    </w:p>
+    <w:p/>
+    <w:p>
+      <w:r>
+        <w:t>---</w:t>
+      </w:r>
+    </w:p>
+    <w:p/>
+    <w:p>
+      <w:r>
+        <w:t xml:space="preserve">### </w:t>
+      </w:r>
+      <w:r>
+        <w:rPr>
+          <w:rFonts w:ascii="Segoe UI Emoji" w:hAnsi="Segoe UI Emoji" w:cs="Segoe UI Emoji"/>
+        </w:rPr>
+        <w:t>⚪</w:t>
+      </w:r>
+      <w:r>
+        <w:t xml:space="preserve"> Tier 4: STATIC/LOCAL SCREENS </w:t>
+      </w:r>
+      <w:r>
+        <w:rPr>
+          <w:rFonts w:ascii="Calibri" w:hAnsi="Calibri" w:cs="Calibri"/>
+        </w:rPr>
+        <w:t>—</w:t>
+      </w:r>
+      <w:r>
+        <w:t xml:space="preserve"> No API Needed (7 screens)</w:t>
+      </w:r>
+    </w:p>
+    <w:p>
+      <w:r>
+        <w:t>These screens are local-only and work correctly without backend calls.</w:t>
+      </w:r>
+    </w:p>
+    <w:p/>
+    <w:p>
+      <w:r>
+        <w:t>`languages`, `notifications` (context-driven), `order-tracking` (component-based), `premium` (info page), `society` (router), `</w:t>
+      </w:r>
+      <w:proofErr w:type="spellStart"/>
+      <w:r>
+        <w:t>sos</w:t>
+      </w:r>
+      <w:proofErr w:type="spellEnd"/>
+      <w:r>
+        <w:t>-dashboard` (context), `tracking` (component)</w:t>
+      </w:r>
+    </w:p>
+    <w:p/>
+    <w:p>
+      <w:r>
+        <w:t>---</w:t>
+      </w:r>
+    </w:p>
+    <w:p/>
+    <w:p>
+      <w:r>
+        <w:t>## Additional Critical Bugs Found</w:t>
+      </w:r>
+    </w:p>
+    <w:p/>
+    <w:p>
+      <w:r>
+        <w:t xml:space="preserve">### </w:t>
+      </w:r>
+      <w:r>
+        <w:rPr>
+          <w:rFonts w:ascii="Segoe UI Emoji" w:hAnsi="Segoe UI Emoji" w:cs="Segoe UI Emoji"/>
+        </w:rPr>
+        <w:t>🔴</w:t>
+      </w:r>
+      <w:r>
+        <w:t xml:space="preserve"> Bug 1: `socket.io-client` Missing </w:t>
+      </w:r>
+      <w:proofErr w:type="gramStart"/>
+      <w:r>
+        <w:t>From</w:t>
+      </w:r>
+      <w:proofErr w:type="gramEnd"/>
+      <w:r>
+        <w:t xml:space="preserve"> Dependencies</w:t>
+      </w:r>
+    </w:p>
+    <w:p>
+      <w:r>
+        <w:t>**</w:t>
+      </w:r>
+      <w:proofErr w:type="gramStart"/>
+      <w:r>
+        <w:t>File:*</w:t>
+      </w:r>
+      <w:proofErr w:type="gramEnd"/>
+      <w:r>
+        <w:t>* [package.json](file:///e:/localsampark%2027-07-2026/localsampark%2027-07-2026/apps/mobile/package.json)</w:t>
+      </w:r>
+    </w:p>
+    <w:p>
+      <w:r>
+        <w:t>All real-time features are completely dead: live order updates, new order alerts, delivery tracking, chat.</w:t>
+      </w:r>
+    </w:p>
+    <w:p/>
+    <w:p>
+      <w:r>
+        <w:t xml:space="preserve">### </w:t>
+      </w:r>
+      <w:r>
+        <w:rPr>
+          <w:rFonts w:ascii="Segoe UI Emoji" w:hAnsi="Segoe UI Emoji" w:cs="Segoe UI Emoji"/>
+        </w:rPr>
+        <w:t>🔴</w:t>
+      </w:r>
+      <w:r>
+        <w:t xml:space="preserve"> Bug 2: Shop Detail Invisible Text</w:t>
+      </w:r>
+    </w:p>
+    <w:p>
+      <w:r>
+        <w:lastRenderedPageBreak/>
+        <w:t>**</w:t>
+      </w:r>
+      <w:proofErr w:type="gramStart"/>
+      <w:r>
+        <w:t>File:*</w:t>
+      </w:r>
+      <w:proofErr w:type="gramEnd"/>
+      <w:r>
+        <w:t>* [shop/[id].js](file:///e:/localsampark%2027-07-2026/localsampark%2027-07-2026/apps/mobile/app/modules/shop/%5Bid%5D.js#L152)</w:t>
+      </w:r>
+    </w:p>
+    <w:p>
+      <w:r>
+        <w:t>Product name color `#e2e8f0` on white `#ffffff` background = invisible. Button text `#0f172a` on blue = hard to read.</w:t>
+      </w:r>
+    </w:p>
+    <w:p/>
+    <w:p>
+      <w:r>
+        <w:t xml:space="preserve">### </w:t>
+      </w:r>
+      <w:r>
+        <w:rPr>
+          <w:rFonts w:ascii="Segoe UI Emoji" w:hAnsi="Segoe UI Emoji" w:cs="Segoe UI Emoji"/>
+        </w:rPr>
+        <w:t>🔴</w:t>
+      </w:r>
+      <w:r>
+        <w:t xml:space="preserve"> Bug 3: Checkout Completely Disconnected </w:t>
+      </w:r>
+      <w:proofErr w:type="gramStart"/>
+      <w:r>
+        <w:t>From</w:t>
+      </w:r>
+      <w:proofErr w:type="gramEnd"/>
+      <w:r>
+        <w:t xml:space="preserve"> Cart Store</w:t>
+      </w:r>
+    </w:p>
+    <w:p>
+      <w:r>
+        <w:t>**</w:t>
+      </w:r>
+      <w:proofErr w:type="gramStart"/>
+      <w:r>
+        <w:t>File:*</w:t>
+      </w:r>
+      <w:proofErr w:type="gramEnd"/>
+      <w:r>
+        <w:t>* [checkout/index.js](file:///e:/localsampark%2027-07-2026/localsampark%2027-07-2026/apps/mobile/app/modules/checkout/index.js#L8)</w:t>
+      </w:r>
+    </w:p>
+    <w:p>
+      <w:r>
+        <w:t>`</w:t>
+      </w:r>
+      <w:proofErr w:type="spellStart"/>
+      <w:r>
+        <w:t>cartTotal</w:t>
+      </w:r>
+      <w:proofErr w:type="spellEnd"/>
+      <w:r>
+        <w:t xml:space="preserve"> = 340` is hardcoded. The checkout screen doesn't import or read from `</w:t>
+      </w:r>
+      <w:proofErr w:type="spellStart"/>
+      <w:r>
+        <w:t>useCartStore</w:t>
+      </w:r>
+      <w:proofErr w:type="spellEnd"/>
+      <w:r>
+        <w:t>` at all. Payment is faked with `</w:t>
+      </w:r>
+      <w:proofErr w:type="spellStart"/>
+      <w:r>
+        <w:t>setTimeout</w:t>
+      </w:r>
+      <w:proofErr w:type="spellEnd"/>
+      <w:r>
+        <w:t>`.</w:t>
+      </w:r>
+    </w:p>
+    <w:p/>
+    <w:p>
+      <w:r>
+        <w:t xml:space="preserve">### </w:t>
+      </w:r>
+      <w:r>
+        <w:rPr>
+          <w:rFonts w:ascii="Segoe UI Emoji" w:hAnsi="Segoe UI Emoji" w:cs="Segoe UI Emoji"/>
+        </w:rPr>
+        <w:t>🔴</w:t>
+      </w:r>
+      <w:r>
+        <w:t xml:space="preserve"> Bug 4: </w:t>
+      </w:r>
+      <w:proofErr w:type="spellStart"/>
+      <w:r>
+        <w:t>FloatingCheckoutBar</w:t>
+      </w:r>
+      <w:proofErr w:type="spellEnd"/>
+      <w:r>
+        <w:t xml:space="preserve"> Hardcoded on Home Screen</w:t>
+      </w:r>
+    </w:p>
+    <w:p>
+      <w:r>
+        <w:t>**</w:t>
+      </w:r>
+      <w:proofErr w:type="gramStart"/>
+      <w:r>
+        <w:t>File:*</w:t>
+      </w:r>
+      <w:proofErr w:type="gramEnd"/>
+      <w:r>
+        <w:t>* [ResidentDashboard.js](file:///e:/localsampark%2027-07-2026/localsampark%2027-07-2026/apps/mobile/src/screens/dashboards/ResidentDashboard.js#L199-L203)</w:t>
+      </w:r>
+    </w:p>
+    <w:p>
+      <w:r>
+        <w:t>Shows `</w:t>
+      </w:r>
+      <w:proofErr w:type="spellStart"/>
+      <w:r>
+        <w:t>itemCount</w:t>
+      </w:r>
+      <w:proofErr w:type="spellEnd"/>
+      <w:proofErr w:type="gramStart"/>
+      <w:r>
+        <w:t>={</w:t>
+      </w:r>
+      <w:proofErr w:type="gramEnd"/>
+      <w:r>
+        <w:t>2}` and `</w:t>
+      </w:r>
+      <w:proofErr w:type="spellStart"/>
+      <w:r>
+        <w:t>totalAmount</w:t>
+      </w:r>
+      <w:proofErr w:type="spellEnd"/>
+      <w:r>
+        <w:t>={345}` always, regardless of actual cart state.</w:t>
+      </w:r>
+    </w:p>
+    <w:p/>
+    <w:p>
+      <w:r>
+        <w:t xml:space="preserve">### </w:t>
+      </w:r>
+      <w:r>
+        <w:rPr>
+          <w:rFonts w:ascii="Segoe UI Emoji" w:hAnsi="Segoe UI Emoji" w:cs="Segoe UI Emoji"/>
+        </w:rPr>
+        <w:t>🟠</w:t>
+      </w:r>
+      <w:r>
+        <w:t xml:space="preserve"> Bug 5: Search Bar Non-Functional</w:t>
+      </w:r>
+    </w:p>
+    <w:p>
+      <w:r>
+        <w:t>**</w:t>
+      </w:r>
+      <w:proofErr w:type="gramStart"/>
+      <w:r>
+        <w:t>File:*</w:t>
+      </w:r>
+      <w:proofErr w:type="gramEnd"/>
+      <w:r>
+        <w:t>* [ResidentDashboard.js](file:///e:/localsampark%2027-07-2026/localsampark%2027-07-2026/apps/mobile/src/screens/dashboards/ResidentDashboard.js#L93-L100)</w:t>
+      </w:r>
+    </w:p>
+    <w:p>
+      <w:r>
+        <w:t>`</w:t>
+      </w:r>
+      <w:proofErr w:type="spellStart"/>
+      <w:r>
+        <w:t>TextInput</w:t>
+      </w:r>
+      <w:proofErr w:type="spellEnd"/>
+      <w:r>
+        <w:t>` has no `</w:t>
+      </w:r>
+      <w:proofErr w:type="spellStart"/>
+      <w:r>
+        <w:t>onSubmitEditing</w:t>
+      </w:r>
+      <w:proofErr w:type="spellEnd"/>
+      <w:r>
+        <w:t>` or navigation to search screen.</w:t>
+      </w:r>
+    </w:p>
+    <w:p/>
+    <w:p>
+      <w:r>
+        <w:t xml:space="preserve">### </w:t>
+      </w:r>
+      <w:r>
+        <w:rPr>
+          <w:rFonts w:ascii="Segoe UI Emoji" w:hAnsi="Segoe UI Emoji" w:cs="Segoe UI Emoji"/>
+        </w:rPr>
+        <w:t>🟠</w:t>
+      </w:r>
+      <w:r>
+        <w:t xml:space="preserve"> Bug 6: `</w:t>
+      </w:r>
+      <w:proofErr w:type="spellStart"/>
+      <w:r>
+        <w:t>addToCart</w:t>
+      </w:r>
+      <w:proofErr w:type="spellEnd"/>
+      <w:r>
+        <w:t>` Wrong Function Signature</w:t>
+      </w:r>
+    </w:p>
+    <w:p>
+      <w:r>
+        <w:t>**</w:t>
+      </w:r>
+      <w:proofErr w:type="gramStart"/>
+      <w:r>
+        <w:t>File:*</w:t>
+      </w:r>
+      <w:proofErr w:type="gramEnd"/>
+      <w:r>
+        <w:t>* [shop/[id].js](file:///e:/localsampark%2027-07-2026/localsampark%2027-07-2026/apps/mobile/app/modules/shop/%5Bid%5D.js#L83)</w:t>
+      </w:r>
+    </w:p>
+    <w:p>
+      <w:r>
+        <w:t>Called as `</w:t>
+      </w:r>
+      <w:proofErr w:type="spellStart"/>
+      <w:proofErr w:type="gramStart"/>
+      <w:r>
+        <w:t>addToCart</w:t>
+      </w:r>
+      <w:proofErr w:type="spellEnd"/>
+      <w:r>
+        <w:t>(</w:t>
+      </w:r>
+      <w:proofErr w:type="gramEnd"/>
+      <w:r>
+        <w:t>item, 1, shop.id)` but store expects `</w:t>
+      </w:r>
+      <w:proofErr w:type="spellStart"/>
+      <w:r>
+        <w:t>addItem</w:t>
+      </w:r>
+      <w:proofErr w:type="spellEnd"/>
+      <w:r>
+        <w:t xml:space="preserve">(product, quantity, </w:t>
+      </w:r>
+      <w:proofErr w:type="spellStart"/>
+      <w:r>
+        <w:t>customOptions</w:t>
+      </w:r>
+      <w:proofErr w:type="spellEnd"/>
+      <w:r>
+        <w:t>)`. `shop.id` becomes `</w:t>
+      </w:r>
+      <w:proofErr w:type="spellStart"/>
+      <w:r>
+        <w:t>customOptions</w:t>
+      </w:r>
+      <w:proofErr w:type="spellEnd"/>
+      <w:r>
+        <w:t>` instead of properly setting `</w:t>
+      </w:r>
+      <w:proofErr w:type="spellStart"/>
+      <w:r>
+        <w:t>shop_id</w:t>
+      </w:r>
+      <w:proofErr w:type="spellEnd"/>
+      <w:r>
+        <w:t>` on the product object.</w:t>
+      </w:r>
+    </w:p>
+    <w:p/>
+    <w:p>
+      <w:r>
+        <w:t xml:space="preserve">### </w:t>
+      </w:r>
+      <w:r>
+        <w:rPr>
+          <w:rFonts w:ascii="Segoe UI Emoji" w:hAnsi="Segoe UI Emoji" w:cs="Segoe UI Emoji"/>
+        </w:rPr>
+        <w:t>🟡</w:t>
+      </w:r>
+      <w:r>
+        <w:t xml:space="preserve"> Bug 7: Directory Uses Demo Shops When API Returns Empty</w:t>
+      </w:r>
+    </w:p>
+    <w:p>
+      <w:r>
+        <w:t>**</w:t>
+      </w:r>
+      <w:proofErr w:type="gramStart"/>
+      <w:r>
+        <w:t>File:*</w:t>
+      </w:r>
+      <w:proofErr w:type="gramEnd"/>
+      <w:r>
+        <w:t>* [directory.js](file:///e:/localsampark%2027-07-2026/localsampark%2027-07-2026/apps/mobile/app/%28tabs%29/directory.js#L13-L25)</w:t>
+      </w:r>
+    </w:p>
+    <w:p>
+      <w:r>
+        <w:t>12 hardcoded `DEMO_SHOPS` are shown as fallback. This is acceptable for dev but needs a `[DEMO]` badge.</w:t>
+      </w:r>
+    </w:p>
+    <w:p/>
+    <w:p>
+      <w:r>
+        <w:t>---</w:t>
+      </w:r>
+    </w:p>
+    <w:p/>
+    <w:p>
+      <w:r>
+        <w:t>## Proposed Changes — 6 Phases</w:t>
+      </w:r>
+    </w:p>
+    <w:p/>
+    <w:p>
+      <w:r>
+        <w:t>---</w:t>
+      </w:r>
+    </w:p>
+    <w:p/>
+    <w:p>
+      <w:r>
+        <w:t>### Phase 1: Fix Core User Journey (Login → Browse → Cart → Checkout → Track)</w:t>
+      </w:r>
+    </w:p>
+    <w:p/>
+    <w:p>
+      <w:r>
+        <w:t xml:space="preserve">&gt; </w:t>
+      </w:r>
+      <w:proofErr w:type="gramStart"/>
+      <w:r>
+        <w:t>[!IMPORTANT</w:t>
+      </w:r>
+      <w:proofErr w:type="gramEnd"/>
+      <w:r>
+        <w:t>]</w:t>
+      </w:r>
+    </w:p>
+    <w:p>
+      <w:r>
+        <w:t>&gt; This phase fixes the most critical user-facing flow. Without these fixes, no purchase can be completed.</w:t>
+      </w:r>
+    </w:p>
+    <w:p/>
+    <w:p>
+      <w:r>
+        <w:t>#### [MODIFY] [</w:t>
+      </w:r>
+      <w:proofErr w:type="gramStart"/>
+      <w:r>
+        <w:t>package.json</w:t>
+      </w:r>
+      <w:proofErr w:type="gramEnd"/>
+      <w:r>
+        <w:t>](file:///e:/localsampark%2027-07-2026/localsampark%2027-07-2026/apps/mobile/package.json)</w:t>
+      </w:r>
+    </w:p>
+    <w:p>
+      <w:r>
+        <w:t>- Add `"socket.io-client": "^4.7.0"` to dependencies</w:t>
+      </w:r>
+    </w:p>
+    <w:p/>
+    <w:p>
+      <w:r>
+        <w:t>#### [MODIFY] [shop/[id].</w:t>
+      </w:r>
+      <w:proofErr w:type="gramStart"/>
+      <w:r>
+        <w:t>js](</w:t>
+      </w:r>
+      <w:proofErr w:type="gramEnd"/>
+      <w:r>
+        <w:t>file:///e:/localsampark%2027-07-2026/localsampark%2027-07-2026/apps/mobile/app/modules/shop/%5Bid%5D.js)</w:t>
+      </w:r>
+    </w:p>
+    <w:p>
+      <w:r>
+        <w:t>- Replace hardcoded mock shop/products with `</w:t>
+      </w:r>
+      <w:proofErr w:type="spellStart"/>
+      <w:r>
+        <w:t>apiGet</w:t>
+      </w:r>
+      <w:proofErr w:type="spellEnd"/>
+      <w:r>
+        <w:t>('/shops/${id}</w:t>
+      </w:r>
+      <w:proofErr w:type="gramStart"/>
+      <w:r>
+        <w:t>')`</w:t>
+      </w:r>
+      <w:proofErr w:type="gramEnd"/>
+      <w:r>
+        <w:t xml:space="preserve"> and `</w:t>
+      </w:r>
+      <w:proofErr w:type="spellStart"/>
+      <w:r>
+        <w:t>apiGet</w:t>
+      </w:r>
+      <w:proofErr w:type="spellEnd"/>
+      <w:r>
+        <w:t>('/shops/${id}/products')`</w:t>
+      </w:r>
+    </w:p>
+    <w:p>
+      <w:r>
+        <w:t>- Keep current mock data as fallback when API fails (for dev testing)</w:t>
+      </w:r>
+    </w:p>
+    <w:p>
+      <w:r>
+        <w:t>- Fix `</w:t>
+      </w:r>
+      <w:proofErr w:type="spellStart"/>
+      <w:r>
+        <w:t>addToCart</w:t>
+      </w:r>
+      <w:proofErr w:type="spellEnd"/>
+      <w:r>
+        <w:t xml:space="preserve">` to pass product with </w:t>
+      </w:r>
+      <w:proofErr w:type="gramStart"/>
+      <w:r>
+        <w:t>`{ ...</w:t>
+      </w:r>
+      <w:proofErr w:type="gramEnd"/>
+      <w:r>
+        <w:t xml:space="preserve">product, </w:t>
+      </w:r>
+      <w:proofErr w:type="spellStart"/>
+      <w:r>
+        <w:t>shop_id</w:t>
+      </w:r>
+      <w:proofErr w:type="spellEnd"/>
+      <w:r>
+        <w:t xml:space="preserve">: shop.id, </w:t>
+      </w:r>
+      <w:proofErr w:type="spellStart"/>
+      <w:r>
+        <w:t>shop_name</w:t>
+      </w:r>
+      <w:proofErr w:type="spellEnd"/>
+      <w:r>
+        <w:t>: shop.name }`</w:t>
+      </w:r>
+    </w:p>
+    <w:p>
+      <w:r>
+        <w:t>- Fix `</w:t>
+      </w:r>
+      <w:proofErr w:type="spellStart"/>
+      <w:r>
+        <w:t>productName</w:t>
+      </w:r>
+      <w:proofErr w:type="spellEnd"/>
+      <w:r>
+        <w:t>` color to `#0f172a` and `</w:t>
+      </w:r>
+      <w:proofErr w:type="spellStart"/>
+      <w:r>
+        <w:t>addBtnText</w:t>
+      </w:r>
+      <w:proofErr w:type="spellEnd"/>
+      <w:r>
+        <w:t>` color to `#ffffff`</w:t>
+      </w:r>
+    </w:p>
+    <w:p>
+      <w:r>
+        <w:t>- Add loading skeleton and error states</w:t>
+      </w:r>
+    </w:p>
+    <w:p/>
+    <w:p>
+      <w:r>
+        <w:t>#### [MODIFY] [</w:t>
+      </w:r>
+      <w:proofErr w:type="gramStart"/>
+      <w:r>
+        <w:t>checkout/index.js](</w:t>
+      </w:r>
+      <w:proofErr w:type="gramEnd"/>
+      <w:r>
+        <w:t>file:///e:/localsampark%2027-07-2026/localsampark%2027-07-2026/apps/mobile/app/modules/checkout/index.js)</w:t>
+      </w:r>
+    </w:p>
+    <w:p>
+      <w:r>
+        <w:t>- Import and read from `</w:t>
+      </w:r>
+      <w:proofErr w:type="spellStart"/>
+      <w:r>
+        <w:t>useCartStore</w:t>
+      </w:r>
+      <w:proofErr w:type="spellEnd"/>
+      <w:r>
+        <w:t>` for real cart items and totals</w:t>
+      </w:r>
+    </w:p>
+    <w:p>
+      <w:r>
+        <w:t>- Replace `</w:t>
+      </w:r>
+      <w:proofErr w:type="spellStart"/>
+      <w:r>
+        <w:t>cartTotal</w:t>
+      </w:r>
+      <w:proofErr w:type="spellEnd"/>
+      <w:r>
+        <w:t xml:space="preserve"> = 340` with `</w:t>
+      </w:r>
+      <w:proofErr w:type="spellStart"/>
+      <w:r>
+        <w:t>useCartStore.getCartTotal</w:t>
+      </w:r>
+      <w:proofErr w:type="spellEnd"/>
+      <w:proofErr w:type="gramStart"/>
+      <w:r>
+        <w:t>()`</w:t>
+      </w:r>
+      <w:proofErr w:type="gramEnd"/>
+    </w:p>
+    <w:p>
+      <w:r>
+        <w:t>- Connect payment to real `</w:t>
+      </w:r>
+      <w:proofErr w:type="spellStart"/>
+      <w:r>
+        <w:t>apiPost</w:t>
+      </w:r>
+      <w:proofErr w:type="spellEnd"/>
+      <w:r>
+        <w:t>('/checkout</w:t>
+      </w:r>
+      <w:proofErr w:type="gramStart"/>
+      <w:r>
+        <w:t>')`</w:t>
+      </w:r>
+      <w:proofErr w:type="gramEnd"/>
+      <w:r>
+        <w:t xml:space="preserve"> endpoint with mock fallback</w:t>
+      </w:r>
+    </w:p>
+    <w:p>
+      <w:r>
+        <w:lastRenderedPageBreak/>
+        <w:t>- Show actual cart items list in checkout view</w:t>
+      </w:r>
+    </w:p>
+    <w:p/>
+    <w:p>
+      <w:r>
+        <w:t>#### [MODIFY] [</w:t>
+      </w:r>
+      <w:proofErr w:type="gramStart"/>
+      <w:r>
+        <w:t>ResidentDashboard.js](</w:t>
+      </w:r>
+      <w:proofErr w:type="gramEnd"/>
+      <w:r>
+        <w:t>file:///e:/localsampark%2027-07-2026/localsampark%2027-07-2026/apps/mobile/src/screens/dashboards/ResidentDashboard.js)</w:t>
+      </w:r>
+    </w:p>
+    <w:p>
+      <w:r>
+        <w:t>- Connect `</w:t>
+      </w:r>
+      <w:proofErr w:type="spellStart"/>
+      <w:r>
+        <w:t>FloatingCheckoutBar</w:t>
+      </w:r>
+      <w:proofErr w:type="spellEnd"/>
+      <w:r>
+        <w:t>` to `</w:t>
+      </w:r>
+      <w:proofErr w:type="spellStart"/>
+      <w:r>
+        <w:t>useCartStore</w:t>
+      </w:r>
+      <w:proofErr w:type="spellEnd"/>
+      <w:r>
+        <w:t>` for real `</w:t>
+      </w:r>
+      <w:proofErr w:type="spellStart"/>
+      <w:r>
+        <w:t>itemCount</w:t>
+      </w:r>
+      <w:proofErr w:type="spellEnd"/>
+      <w:r>
+        <w:t>` and `</w:t>
+      </w:r>
+      <w:proofErr w:type="spellStart"/>
+      <w:r>
+        <w:t>totalAmount</w:t>
+      </w:r>
+      <w:proofErr w:type="spellEnd"/>
+      <w:r>
+        <w:t>`</w:t>
+      </w:r>
+    </w:p>
+    <w:p>
+      <w:r>
+        <w:t xml:space="preserve">- Only show </w:t>
+      </w:r>
+      <w:proofErr w:type="spellStart"/>
+      <w:r>
+        <w:t>FloatingCheckoutBar</w:t>
+      </w:r>
+      <w:proofErr w:type="spellEnd"/>
+      <w:r>
+        <w:t xml:space="preserve"> when cart has items (`</w:t>
+      </w:r>
+      <w:proofErr w:type="spellStart"/>
+      <w:proofErr w:type="gramStart"/>
+      <w:r>
+        <w:t>getItemCount</w:t>
+      </w:r>
+      <w:proofErr w:type="spellEnd"/>
+      <w:r>
+        <w:t>(</w:t>
+      </w:r>
+      <w:proofErr w:type="gramEnd"/>
+      <w:r>
+        <w:t>) &gt; 0`)</w:t>
+      </w:r>
+    </w:p>
+    <w:p>
+      <w:r>
+        <w:t>- Make search bar navigate to `/search` screen on focus</w:t>
+      </w:r>
+    </w:p>
+    <w:p/>
+    <w:p>
+      <w:r>
+        <w:t>#### [MODIFY] [</w:t>
+      </w:r>
+      <w:proofErr w:type="gramStart"/>
+      <w:r>
+        <w:t>socket.js](</w:t>
+      </w:r>
+      <w:proofErr w:type="gramEnd"/>
+      <w:r>
+        <w:t>file:///e:/localsampark%2027-07-2026/localsampark%2027-07-2026/apps/mobile/src/services/socket.js)</w:t>
+      </w:r>
+    </w:p>
+    <w:p>
+      <w:r>
+        <w:t>- Update socket URL to use `API_BASE` (without `/</w:t>
+      </w:r>
+      <w:proofErr w:type="spellStart"/>
+      <w:r>
+        <w:t>api</w:t>
+      </w:r>
+      <w:proofErr w:type="spellEnd"/>
+      <w:r>
+        <w:t>/v1` suffix) for production</w:t>
+      </w:r>
+    </w:p>
+    <w:p/>
+    <w:p>
+      <w:r>
+        <w:t>---</w:t>
+      </w:r>
+    </w:p>
+    <w:p/>
+    <w:p>
+      <w:r>
+        <w:t>### Phase 2: Upgrade Tier 1 Screens (14 Fully-Mocked → API + Mock Fallback)</w:t>
+      </w:r>
+    </w:p>
+    <w:p/>
+    <w:p>
+      <w:r>
+        <w:t>For each screen, the pattern will be:</w:t>
+      </w:r>
+    </w:p>
+    <w:p>
+      <w:r>
+        <w:t>1. Import `</w:t>
+      </w:r>
+      <w:proofErr w:type="spellStart"/>
+      <w:r>
+        <w:t>apiGet</w:t>
+      </w:r>
+      <w:proofErr w:type="spellEnd"/>
+      <w:r>
+        <w:t>`/`</w:t>
+      </w:r>
+      <w:proofErr w:type="spellStart"/>
+      <w:r>
+        <w:t>apiPost</w:t>
+      </w:r>
+      <w:proofErr w:type="spellEnd"/>
+      <w:r>
+        <w:t>` from the API lib</w:t>
+      </w:r>
+    </w:p>
+    <w:p>
+      <w:r>
+        <w:t>2. Add a `</w:t>
+      </w:r>
+      <w:proofErr w:type="spellStart"/>
+      <w:r>
+        <w:t>useEffect</w:t>
+      </w:r>
+      <w:proofErr w:type="spellEnd"/>
+      <w:r>
+        <w:t>` to fetch real data from the correct backend endpoint</w:t>
+      </w:r>
+    </w:p>
+    <w:p>
+      <w:r>
+        <w:t>3. Keep the current mock data as fallback when API returns error</w:t>
+      </w:r>
+    </w:p>
+    <w:p>
+      <w:r>
+        <w:t xml:space="preserve">4. Add a small </w:t>
+      </w:r>
+      <w:proofErr w:type="gramStart"/>
+      <w:r>
+        <w:t>`[</w:t>
+      </w:r>
+      <w:proofErr w:type="gramEnd"/>
+      <w:r>
+        <w:t>DEMO DATA]` badge when showing mock data</w:t>
+      </w:r>
+    </w:p>
+    <w:p>
+      <w:r>
+        <w:t>5. Add loading skeleton while fetching</w:t>
+      </w:r>
+    </w:p>
+    <w:p/>
+    <w:p>
+      <w:r>
+        <w:t>#### [MODIFY] order-history/index.js</w:t>
+      </w:r>
+    </w:p>
+    <w:p>
+      <w:r>
+        <w:t>- Fetch from `</w:t>
+      </w:r>
+      <w:proofErr w:type="spellStart"/>
+      <w:r>
+        <w:t>apiGet</w:t>
+      </w:r>
+      <w:proofErr w:type="spellEnd"/>
+      <w:r>
+        <w:t>('/orders</w:t>
+      </w:r>
+      <w:proofErr w:type="gramStart"/>
+      <w:r>
+        <w:t>')`</w:t>
+      </w:r>
+      <w:proofErr w:type="gramEnd"/>
+      <w:r>
+        <w:t xml:space="preserve"> → fallback to existing mock orders</w:t>
+      </w:r>
+    </w:p>
+    <w:p/>
+    <w:p>
+      <w:r>
+        <w:t>#### [MODIFY] pets/index.js</w:t>
+      </w:r>
+    </w:p>
+    <w:p>
+      <w:r>
+        <w:t>- Fetch from `</w:t>
+      </w:r>
+      <w:proofErr w:type="spellStart"/>
+      <w:r>
+        <w:t>apiGet</w:t>
+      </w:r>
+      <w:proofErr w:type="spellEnd"/>
+      <w:r>
+        <w:t>('/pets</w:t>
+      </w:r>
+      <w:proofErr w:type="gramStart"/>
+      <w:r>
+        <w:t>')`</w:t>
+      </w:r>
+      <w:proofErr w:type="gramEnd"/>
+      <w:r>
+        <w:t xml:space="preserve"> → fallback to existing mock pets</w:t>
+      </w:r>
+    </w:p>
+    <w:p/>
+    <w:p>
+      <w:r>
+        <w:lastRenderedPageBreak/>
+        <w:t>#### [MODIFY] pharmacy/index.js</w:t>
+      </w:r>
+    </w:p>
+    <w:p>
+      <w:r>
+        <w:t>- Fetch from `</w:t>
+      </w:r>
+      <w:proofErr w:type="spellStart"/>
+      <w:r>
+        <w:t>apiGet</w:t>
+      </w:r>
+      <w:proofErr w:type="spellEnd"/>
+      <w:r>
+        <w:t>('/</w:t>
+      </w:r>
+      <w:proofErr w:type="spellStart"/>
+      <w:r>
+        <w:t>shops?category</w:t>
+      </w:r>
+      <w:proofErr w:type="spellEnd"/>
+      <w:r>
+        <w:t>=Pharmacy</w:t>
+      </w:r>
+      <w:proofErr w:type="gramStart"/>
+      <w:r>
+        <w:t>')`</w:t>
+      </w:r>
+      <w:proofErr w:type="gramEnd"/>
+      <w:r>
+        <w:t xml:space="preserve"> → fallback to mock</w:t>
+      </w:r>
+    </w:p>
+    <w:p/>
+    <w:p>
+      <w:r>
+        <w:t>#### [MODIFY] promotions/index.js</w:t>
+      </w:r>
+    </w:p>
+    <w:p>
+      <w:r>
+        <w:t>- Fetch from `</w:t>
+      </w:r>
+      <w:proofErr w:type="spellStart"/>
+      <w:r>
+        <w:t>apiGet</w:t>
+      </w:r>
+      <w:proofErr w:type="spellEnd"/>
+      <w:r>
+        <w:t>('/shops/promotions</w:t>
+      </w:r>
+      <w:proofErr w:type="gramStart"/>
+      <w:r>
+        <w:t>')`</w:t>
+      </w:r>
+      <w:proofErr w:type="gramEnd"/>
+      <w:r>
+        <w:t xml:space="preserve"> → fallback to mock</w:t>
+      </w:r>
+    </w:p>
+    <w:p/>
+    <w:p>
+      <w:r>
+        <w:t>#### [MODIFY] register-shop/index.js</w:t>
+      </w:r>
+    </w:p>
+    <w:p>
+      <w:r>
+        <w:t>- Submit form via `</w:t>
+      </w:r>
+      <w:proofErr w:type="spellStart"/>
+      <w:r>
+        <w:t>apiPost</w:t>
+      </w:r>
+      <w:proofErr w:type="spellEnd"/>
+      <w:r>
+        <w:t>('/shops/register</w:t>
+      </w:r>
+      <w:proofErr w:type="gramStart"/>
+      <w:r>
+        <w:t>')`</w:t>
+      </w:r>
+      <w:proofErr w:type="gramEnd"/>
+      <w:r>
+        <w:t xml:space="preserve"> → fallback to mock success</w:t>
+      </w:r>
+    </w:p>
+    <w:p/>
+    <w:p>
+      <w:r>
+        <w:t>#### [MODIFY] service-booking/index.js &amp; service-booking/[id]/index.js</w:t>
+      </w:r>
+    </w:p>
+    <w:p>
+      <w:r>
+        <w:t>- Fetch from `</w:t>
+      </w:r>
+      <w:proofErr w:type="spellStart"/>
+      <w:r>
+        <w:t>apiGet</w:t>
+      </w:r>
+      <w:proofErr w:type="spellEnd"/>
+      <w:r>
+        <w:t>('/services</w:t>
+      </w:r>
+      <w:proofErr w:type="gramStart"/>
+      <w:r>
+        <w:t>')`</w:t>
+      </w:r>
+      <w:proofErr w:type="gramEnd"/>
+      <w:r>
+        <w:t xml:space="preserve"> and `</w:t>
+      </w:r>
+      <w:proofErr w:type="spellStart"/>
+      <w:r>
+        <w:t>apiPost</w:t>
+      </w:r>
+      <w:proofErr w:type="spellEnd"/>
+      <w:r>
+        <w:t>('/services/book')` → fallback to mock</w:t>
+      </w:r>
+    </w:p>
+    <w:p/>
+    <w:p>
+      <w:r>
+        <w:t>#### [MODIFY] service-detail/index.js</w:t>
+      </w:r>
+    </w:p>
+    <w:p>
+      <w:r>
+        <w:t>- Fetch from `</w:t>
+      </w:r>
+      <w:proofErr w:type="spellStart"/>
+      <w:r>
+        <w:t>apiGet</w:t>
+      </w:r>
+      <w:proofErr w:type="spellEnd"/>
+      <w:r>
+        <w:t>('/services/${id}</w:t>
+      </w:r>
+      <w:proofErr w:type="gramStart"/>
+      <w:r>
+        <w:t>')`</w:t>
+      </w:r>
+      <w:proofErr w:type="gramEnd"/>
+      <w:r>
+        <w:t xml:space="preserve"> → fallback to mock</w:t>
+      </w:r>
+    </w:p>
+    <w:p/>
+    <w:p>
+      <w:r>
+        <w:t>#### [MODIFY] shop-dashboard/index.js</w:t>
+      </w:r>
+    </w:p>
+    <w:p>
+      <w:r>
+        <w:t>- Fetch from `</w:t>
+      </w:r>
+      <w:proofErr w:type="spellStart"/>
+      <w:r>
+        <w:t>apiGet</w:t>
+      </w:r>
+      <w:proofErr w:type="spellEnd"/>
+      <w:r>
+        <w:t>('/shops/my-shop/stats</w:t>
+      </w:r>
+      <w:proofErr w:type="gramStart"/>
+      <w:r>
+        <w:t>')`</w:t>
+      </w:r>
+      <w:proofErr w:type="gramEnd"/>
+      <w:r>
+        <w:t xml:space="preserve"> → fallback to mock stats</w:t>
+      </w:r>
+    </w:p>
+    <w:p/>
+    <w:p>
+      <w:r>
+        <w:t>#### [MODIFY] shops/index.js &amp; shops/[id]/index.js</w:t>
+      </w:r>
+    </w:p>
+    <w:p>
+      <w:r>
+        <w:t>- Fetch from `</w:t>
+      </w:r>
+      <w:proofErr w:type="spellStart"/>
+      <w:r>
+        <w:t>apiGet</w:t>
+      </w:r>
+      <w:proofErr w:type="spellEnd"/>
+      <w:r>
+        <w:t>('/shops</w:t>
+      </w:r>
+      <w:proofErr w:type="gramStart"/>
+      <w:r>
+        <w:t>')`</w:t>
+      </w:r>
+      <w:proofErr w:type="gramEnd"/>
+      <w:r>
+        <w:t xml:space="preserve"> and `</w:t>
+      </w:r>
+      <w:proofErr w:type="spellStart"/>
+      <w:r>
+        <w:t>apiGet</w:t>
+      </w:r>
+      <w:proofErr w:type="spellEnd"/>
+      <w:r>
+        <w:t>('/shops/${id}')` → fallback to mock</w:t>
+      </w:r>
+    </w:p>
+    <w:p/>
+    <w:p>
+      <w:r>
+        <w:t>#### [MODIFY] subscriptions/index.js</w:t>
+      </w:r>
+    </w:p>
+    <w:p>
+      <w:r>
+        <w:t>- Fetch from `</w:t>
+      </w:r>
+      <w:proofErr w:type="spellStart"/>
+      <w:r>
+        <w:t>apiGet</w:t>
+      </w:r>
+      <w:proofErr w:type="spellEnd"/>
+      <w:r>
+        <w:t>('/subscriptions</w:t>
+      </w:r>
+      <w:proofErr w:type="gramStart"/>
+      <w:r>
+        <w:t>')`</w:t>
+      </w:r>
+      <w:proofErr w:type="gramEnd"/>
+      <w:r>
+        <w:t xml:space="preserve"> → fallback to mock plans</w:t>
+      </w:r>
+    </w:p>
+    <w:p/>
+    <w:p>
+      <w:r>
+        <w:t>#### [MODIFY] zone-selector/index.js</w:t>
+      </w:r>
+    </w:p>
+    <w:p>
+      <w:r>
+        <w:t>- Fetch from `</w:t>
+      </w:r>
+      <w:proofErr w:type="spellStart"/>
+      <w:r>
+        <w:t>apiGet</w:t>
+      </w:r>
+      <w:proofErr w:type="spellEnd"/>
+      <w:r>
+        <w:t>('/zones/hierarchy</w:t>
+      </w:r>
+      <w:proofErr w:type="gramStart"/>
+      <w:r>
+        <w:t>')`</w:t>
+      </w:r>
+      <w:proofErr w:type="gramEnd"/>
+      <w:r>
+        <w:t xml:space="preserve"> → fallback to mock zones</w:t>
+      </w:r>
+    </w:p>
+    <w:p/>
+    <w:p>
+      <w:r>
+        <w:t>---</w:t>
+      </w:r>
+    </w:p>
+    <w:p/>
+    <w:p>
+      <w:r>
+        <w:lastRenderedPageBreak/>
+        <w:t>### Phase 3: Improve Tier 2 Screens (11 Mixed-Mode → Better API Integration)</w:t>
+      </w:r>
+    </w:p>
+    <w:p/>
+    <w:p>
+      <w:r>
+        <w:t>These already have API calls but need cleanup:</w:t>
+      </w:r>
+    </w:p>
+    <w:p/>
+    <w:p>
+      <w:r>
+        <w:t>#### [MODIFY] marketplace/index.js, medical/index.js, properties/index.js, scrap/index.js</w:t>
+      </w:r>
+    </w:p>
+    <w:p>
+      <w:r>
+        <w:t>- Add `[DEMO]` badge when showing fallback data</w:t>
+      </w:r>
+    </w:p>
+    <w:p>
+      <w:r>
+        <w:t>- Improve error messages when API fails</w:t>
+      </w:r>
+    </w:p>
+    <w:p/>
+    <w:p>
+      <w:r>
+        <w:t>#### [MODIFY] service/[id]/index.js, service-dashboard/index.js, services/index.js</w:t>
+      </w:r>
+    </w:p>
+    <w:p>
+      <w:r>
+        <w:t>- Same improvements + ensure API endpoints match backend routes</w:t>
+      </w:r>
+    </w:p>
+    <w:p/>
+    <w:p>
+      <w:r>
+        <w:t xml:space="preserve">#### [MODIFY] </w:t>
+      </w:r>
+      <w:proofErr w:type="spellStart"/>
+      <w:r>
+        <w:t>sos</w:t>
+      </w:r>
+      <w:proofErr w:type="spellEnd"/>
+      <w:r>
+        <w:t xml:space="preserve">/index.js, </w:t>
+      </w:r>
+      <w:proofErr w:type="spellStart"/>
+      <w:r>
+        <w:t>townsquare</w:t>
+      </w:r>
+      <w:proofErr w:type="spellEnd"/>
+      <w:r>
+        <w:t>/index.js, volunteer/index.js, wallet/index.js</w:t>
+      </w:r>
+    </w:p>
+    <w:p>
+      <w:r>
+        <w:t>- Same improvements + add loading skeletons</w:t>
+      </w:r>
+    </w:p>
+    <w:p/>
+    <w:p>
+      <w:r>
+        <w:t>---</w:t>
+      </w:r>
+    </w:p>
+    <w:p/>
+    <w:p>
+      <w:r>
+        <w:t>### Phase 4: Create Dev/Mock Testing Environment</w:t>
+      </w:r>
+    </w:p>
+    <w:p/>
+    <w:p>
+      <w:r>
+        <w:t xml:space="preserve">&gt; </w:t>
+      </w:r>
+      <w:proofErr w:type="gramStart"/>
+      <w:r>
+        <w:t>[!IMPORTANT</w:t>
+      </w:r>
+      <w:proofErr w:type="gramEnd"/>
+      <w:r>
+        <w:t>]</w:t>
+      </w:r>
+    </w:p>
+    <w:p>
+      <w:r>
+        <w:t>&gt; Per your request, mock data stays but gets organized into a proper testing system.</w:t>
+      </w:r>
+    </w:p>
+    <w:p/>
+    <w:p>
+      <w:r>
+        <w:t>#### [NEW] [</w:t>
+      </w:r>
+      <w:proofErr w:type="gramStart"/>
+      <w:r>
+        <w:t>src/config/devMode.js](</w:t>
+      </w:r>
+      <w:proofErr w:type="gramEnd"/>
+      <w:r>
+        <w:t>file:///e:/localsampark%2027-07-2026/localsampark%2027-07-2026/apps/mobile/src/config/devMode.js)</w:t>
+      </w:r>
+    </w:p>
+    <w:p>
+      <w:r>
+        <w:t>Create a centralized dev mode configuration:</w:t>
+      </w:r>
+    </w:p>
+    <w:p>
+      <w:r>
+        <w:t>```</w:t>
+      </w:r>
+      <w:proofErr w:type="spellStart"/>
+      <w:r>
+        <w:t>javascript</w:t>
+      </w:r>
+      <w:proofErr w:type="spellEnd"/>
+    </w:p>
+    <w:p>
+      <w:r>
+        <w:t>export const DEV_CONFIG = {</w:t>
+      </w:r>
+    </w:p>
+    <w:p>
+      <w:r>
+        <w:t xml:space="preserve">  SHOW_DEMO_BADGE: </w:t>
+      </w:r>
+      <w:proofErr w:type="gramStart"/>
+      <w:r>
+        <w:t xml:space="preserve">true,   </w:t>
+      </w:r>
+      <w:proofErr w:type="gramEnd"/>
+      <w:r>
+        <w:t xml:space="preserve">    // Show [DEMO] badge on mock data</w:t>
+      </w:r>
+    </w:p>
+    <w:p>
+      <w:r>
+        <w:t xml:space="preserve">  ENABLE_MOCK_LOGIN: </w:t>
+      </w:r>
+      <w:proofErr w:type="gramStart"/>
+      <w:r>
+        <w:t xml:space="preserve">true,   </w:t>
+      </w:r>
+      <w:proofErr w:type="gramEnd"/>
+      <w:r>
+        <w:t xml:space="preserve">  // Allow mock login when backend is down</w:t>
+      </w:r>
+    </w:p>
+    <w:p>
+      <w:r>
+        <w:t xml:space="preserve">  MOCK_WALLET_BALANCE: 750.00, // Mock wallet for testing</w:t>
+      </w:r>
+    </w:p>
+    <w:p>
+      <w:r>
+        <w:lastRenderedPageBreak/>
+        <w:t xml:space="preserve">  LOG_API_CALLS: </w:t>
+      </w:r>
+      <w:proofErr w:type="gramStart"/>
+      <w:r>
+        <w:t xml:space="preserve">true,   </w:t>
+      </w:r>
+      <w:proofErr w:type="gramEnd"/>
+      <w:r>
+        <w:t xml:space="preserve">      // Console log all API requests</w:t>
+      </w:r>
+    </w:p>
+    <w:p>
+      <w:r>
+        <w:t xml:space="preserve">  FORCE_MOCK_DATA: </w:t>
+      </w:r>
+      <w:proofErr w:type="gramStart"/>
+      <w:r>
+        <w:t xml:space="preserve">false,   </w:t>
+      </w:r>
+      <w:proofErr w:type="gramEnd"/>
+      <w:r>
+        <w:t xml:space="preserve">   // Force all screens to use mock data</w:t>
+      </w:r>
+    </w:p>
+    <w:p>
+      <w:r>
+        <w:t>};</w:t>
+      </w:r>
+    </w:p>
+    <w:p>
+      <w:r>
+        <w:t>```</w:t>
+      </w:r>
+    </w:p>
+    <w:p/>
+    <w:p>
+      <w:r>
+        <w:t>#### [NEW] [</w:t>
+      </w:r>
+      <w:proofErr w:type="gramStart"/>
+      <w:r>
+        <w:t>src/utils/mockDataHelper.js](</w:t>
+      </w:r>
+      <w:proofErr w:type="gramEnd"/>
+      <w:r>
+        <w:t>file:///e:/localsampark%2027-07-2026/localsampark%2027-07-2026/apps/mobile/src/utils/mockDataHelper.js)</w:t>
+      </w:r>
+    </w:p>
+    <w:p>
+      <w:r>
+        <w:t>Centralized mock data helper that:</w:t>
+      </w:r>
+    </w:p>
+    <w:p>
+      <w:r>
+        <w:t>- Wraps API calls with automatic mock fallback</w:t>
+      </w:r>
+    </w:p>
+    <w:p>
+      <w:r>
+        <w:t>- Logs when mock data is being used</w:t>
+      </w:r>
+    </w:p>
+    <w:p>
+      <w:r>
+        <w:t>- Shows visual `[DEMO]` badge on screen when showing mock data</w:t>
+      </w:r>
+    </w:p>
+    <w:p/>
+    <w:p>
+      <w:r>
+        <w:t>#### [NEW] [</w:t>
+      </w:r>
+      <w:proofErr w:type="gramStart"/>
+      <w:r>
+        <w:t>src/components/DemoBadge.js](</w:t>
+      </w:r>
+      <w:proofErr w:type="gramEnd"/>
+      <w:r>
+        <w:t>file:///e:/localsampark%2027-07-2026/localsampark%2027-07-2026/apps/mobile/src/components/DemoBadge.js)</w:t>
+      </w:r>
+    </w:p>
+    <w:p>
+      <w:r>
+        <w:t>Reusable component that shows a small `</w:t>
+      </w:r>
+      <w:r>
+        <w:rPr>
+          <w:rFonts w:ascii="Segoe UI Emoji" w:hAnsi="Segoe UI Emoji" w:cs="Segoe UI Emoji"/>
+        </w:rPr>
+        <w:t>🔧</w:t>
+      </w:r>
+      <w:r>
+        <w:t xml:space="preserve"> DEMO DATA` badge at the top of any screen that's using mock/fallback data.</w:t>
+      </w:r>
+    </w:p>
+    <w:p/>
+    <w:p>
+      <w:r>
+        <w:t>#### [MODIFY] [</w:t>
+      </w:r>
+      <w:proofErr w:type="gramStart"/>
+      <w:r>
+        <w:t>AuthContext.js](</w:t>
+      </w:r>
+      <w:proofErr w:type="gramEnd"/>
+      <w:r>
+        <w:t>file:///e:/localsampark%2027-07-2026/localsampark%2027-07-2026/apps/mobile/src/context/AuthContext.js)</w:t>
+      </w:r>
+    </w:p>
+    <w:p>
+      <w:r>
+        <w:t xml:space="preserve">- Keep mock login but show clear </w:t>
+      </w:r>
+      <w:proofErr w:type="gramStart"/>
+      <w:r>
+        <w:t>`[</w:t>
+      </w:r>
+      <w:proofErr w:type="gramEnd"/>
+      <w:r>
+        <w:t>DEV MODE]` indicator in the app</w:t>
+      </w:r>
+    </w:p>
+    <w:p>
+      <w:r>
+        <w:t>- Keep mock wallet fallback but show `[DEMO]` badge</w:t>
+      </w:r>
+    </w:p>
+    <w:p>
+      <w:r>
+        <w:t>- Add `</w:t>
+      </w:r>
+      <w:proofErr w:type="spellStart"/>
+      <w:r>
+        <w:t>isUsingMockData</w:t>
+      </w:r>
+      <w:proofErr w:type="spellEnd"/>
+      <w:r>
+        <w:t>` flag to auth context</w:t>
+      </w:r>
+    </w:p>
+    <w:p/>
+    <w:p>
+      <w:r>
+        <w:t>---</w:t>
+      </w:r>
+    </w:p>
+    <w:p/>
+    <w:p>
+      <w:r>
+        <w:t>### Phase 5: Fix UI/Styling Bugs Across All Screens</w:t>
+      </w:r>
+    </w:p>
+    <w:p/>
+    <w:p>
+      <w:r>
+        <w:t>#### [MODIFY] [shop/[id].</w:t>
+      </w:r>
+      <w:proofErr w:type="gramStart"/>
+      <w:r>
+        <w:t>js](</w:t>
+      </w:r>
+      <w:proofErr w:type="gramEnd"/>
+      <w:r>
+        <w:t>file:///e:/localsampark%2027-07-2026/localsampark%2027-07-2026/apps/mobile/app/modules/shop/%5Bid%5D.js)</w:t>
+      </w:r>
+    </w:p>
+    <w:p>
+      <w:r>
+        <w:t>- `</w:t>
+      </w:r>
+      <w:proofErr w:type="spellStart"/>
+      <w:r>
+        <w:t>productName</w:t>
+      </w:r>
+      <w:proofErr w:type="spellEnd"/>
+      <w:r>
+        <w:t>` color: `#e2e8f0` → `#0f172a`</w:t>
+      </w:r>
+    </w:p>
+    <w:p>
+      <w:r>
+        <w:lastRenderedPageBreak/>
+        <w:t>- `</w:t>
+      </w:r>
+      <w:proofErr w:type="spellStart"/>
+      <w:r>
+        <w:t>addBtnText</w:t>
+      </w:r>
+      <w:proofErr w:type="spellEnd"/>
+      <w:r>
+        <w:t>` color: `#0f172a` → `#ffffff`</w:t>
+      </w:r>
+    </w:p>
+    <w:p>
+      <w:r>
+        <w:t>- `</w:t>
+      </w:r>
+      <w:proofErr w:type="spellStart"/>
+      <w:r>
+        <w:t>shopInfoCard</w:t>
+      </w:r>
+      <w:proofErr w:type="spellEnd"/>
+      <w:r>
+        <w:t>` border color: `#ffffff` → `#e2e8f0`</w:t>
+      </w:r>
+    </w:p>
+    <w:p>
+      <w:r>
+        <w:t>- `</w:t>
+      </w:r>
+      <w:proofErr w:type="spellStart"/>
+      <w:r>
+        <w:t>metaBadge</w:t>
+      </w:r>
+      <w:proofErr w:type="spellEnd"/>
+      <w:r>
+        <w:t xml:space="preserve">` </w:t>
+      </w:r>
+      <w:proofErr w:type="spellStart"/>
+      <w:r>
+        <w:t>bg</w:t>
+      </w:r>
+      <w:proofErr w:type="spellEnd"/>
+      <w:r>
+        <w:t>: `#ffffff` → `#f1f5f9`</w:t>
+      </w:r>
+    </w:p>
+    <w:p/>
+    <w:p>
+      <w:r>
+        <w:t>#### [MODIFY] [</w:t>
+      </w:r>
+      <w:proofErr w:type="gramStart"/>
+      <w:r>
+        <w:t>directory.js](</w:t>
+      </w:r>
+      <w:proofErr w:type="gramEnd"/>
+      <w:r>
+        <w:t>file:///e:/localsampark%2027-07-2026/localsampark%2027-07-2026/apps/mobile/app/%28tabs%29/directory.js)</w:t>
+      </w:r>
+    </w:p>
+    <w:p>
+      <w:r>
+        <w:t>- Add `[DEMO]` tag on demo shop cards</w:t>
+      </w:r>
+    </w:p>
+    <w:p>
+      <w:r>
+        <w:t>- Ensure demo shops are clearly distinguishable from real API shops</w:t>
+      </w:r>
+    </w:p>
+    <w:p/>
+    <w:p>
+      <w:r>
+        <w:t>#### [MODIFY] All dashboard screens</w:t>
+      </w:r>
+    </w:p>
+    <w:p>
+      <w:r>
+        <w:t>- Verify consistent dark theme colors across all 8 role dashboards</w:t>
+      </w:r>
+    </w:p>
+    <w:p>
+      <w:r>
+        <w:t>- Fix any text-on-same-color-background visibility issues</w:t>
+      </w:r>
+    </w:p>
+    <w:p/>
+    <w:p>
+      <w:r>
+        <w:t>---</w:t>
+      </w:r>
+    </w:p>
+    <w:p/>
+    <w:p>
+      <w:r>
+        <w:t>### Phase 6: Build Final Production APK</w:t>
+      </w:r>
+    </w:p>
+    <w:p/>
+    <w:p>
+      <w:r>
+        <w:t>#### Build Steps</w:t>
+      </w:r>
+    </w:p>
+    <w:p>
+      <w:r>
+        <w:t>1. Run `</w:t>
+      </w:r>
+      <w:proofErr w:type="spellStart"/>
+      <w:r>
+        <w:t>npm</w:t>
+      </w:r>
+      <w:proofErr w:type="spellEnd"/>
+      <w:r>
+        <w:t xml:space="preserve"> install` to get new `socket.io-client` dependency</w:t>
+      </w:r>
+    </w:p>
+    <w:p>
+      <w:r>
+        <w:t xml:space="preserve">2. Run </w:t>
+      </w:r>
+      <w:proofErr w:type="spellStart"/>
+      <w:r>
+        <w:t>postinstall</w:t>
+      </w:r>
+      <w:proofErr w:type="spellEnd"/>
+      <w:r>
+        <w:t xml:space="preserve"> patches</w:t>
+      </w:r>
+    </w:p>
+    <w:p>
+      <w:r>
+        <w:t>3. Run Gradle `</w:t>
+      </w:r>
+      <w:proofErr w:type="spellStart"/>
+      <w:r>
+        <w:t>assembleRelease</w:t>
+      </w:r>
+      <w:proofErr w:type="spellEnd"/>
+      <w:r>
+        <w:t>` for arm64-v8a</w:t>
+      </w:r>
+    </w:p>
+    <w:p>
+      <w:r>
+        <w:t>4. Test APK on physical device through complete user journey</w:t>
+      </w:r>
+    </w:p>
+    <w:p/>
+    <w:p>
+      <w:r>
+        <w:t>---</w:t>
+      </w:r>
+    </w:p>
+    <w:p/>
+    <w:p>
+      <w:r>
+        <w:t>## Summary of All Changes</w:t>
+      </w:r>
+    </w:p>
+    <w:p/>
+    <w:p>
+      <w:r>
+        <w:t>| Phase | Files Modified | Files Created | Priority |</w:t>
+      </w:r>
+    </w:p>
+    <w:p>
+      <w:r>
+        <w:t>|-------|---------------|---------------|----------|</w:t>
+      </w:r>
+    </w:p>
+    <w:p>
+      <w:r>
+        <w:lastRenderedPageBreak/>
+        <w:t xml:space="preserve">| Phase 1: Core Journey | 5 files | 0 | </w:t>
+      </w:r>
+      <w:r>
+        <w:rPr>
+          <w:rFonts w:ascii="Segoe UI Emoji" w:hAnsi="Segoe UI Emoji" w:cs="Segoe UI Emoji"/>
+        </w:rPr>
+        <w:t>🔴</w:t>
+      </w:r>
+      <w:r>
+        <w:t xml:space="preserve"> Critical |</w:t>
+      </w:r>
+    </w:p>
+    <w:p>
+      <w:r>
+        <w:t xml:space="preserve">| Phase 2: Tier 1 Screens | 14 files | 0 | </w:t>
+      </w:r>
+      <w:r>
+        <w:rPr>
+          <w:rFonts w:ascii="Segoe UI Emoji" w:hAnsi="Segoe UI Emoji" w:cs="Segoe UI Emoji"/>
+        </w:rPr>
+        <w:t>🔴</w:t>
+      </w:r>
+      <w:r>
+        <w:t xml:space="preserve"> Critical |</w:t>
+      </w:r>
+    </w:p>
+    <w:p>
+      <w:r>
+        <w:t xml:space="preserve">| Phase 3: Tier 2 Screens | 11 files | 0 | </w:t>
+      </w:r>
+      <w:r>
+        <w:rPr>
+          <w:rFonts w:ascii="Segoe UI Emoji" w:hAnsi="Segoe UI Emoji" w:cs="Segoe UI Emoji"/>
+        </w:rPr>
+        <w:t>🟠</w:t>
+      </w:r>
+      <w:r>
+        <w:t xml:space="preserve"> High |</w:t>
+      </w:r>
+    </w:p>
+    <w:p>
+      <w:r>
+        <w:t>| Phase 4: Mock Environment | 1 file (</w:t>
+      </w:r>
+      <w:proofErr w:type="spellStart"/>
+      <w:r>
+        <w:t>AuthContext</w:t>
+      </w:r>
+      <w:proofErr w:type="spellEnd"/>
+      <w:r>
+        <w:t xml:space="preserve">) | 3 new files | </w:t>
+      </w:r>
+      <w:r>
+        <w:rPr>
+          <w:rFonts w:ascii="Segoe UI Emoji" w:hAnsi="Segoe UI Emoji" w:cs="Segoe UI Emoji"/>
+        </w:rPr>
+        <w:t>🟠</w:t>
+      </w:r>
+      <w:r>
+        <w:t xml:space="preserve"> High |</w:t>
+      </w:r>
+    </w:p>
+    <w:p>
+      <w:r>
+        <w:t xml:space="preserve">| Phase 5: UI/Styling | 10+ files | 0 | </w:t>
+      </w:r>
+      <w:r>
+        <w:rPr>
+          <w:rFonts w:ascii="Segoe UI Emoji" w:hAnsi="Segoe UI Emoji" w:cs="Segoe UI Emoji"/>
+        </w:rPr>
+        <w:t>🟡</w:t>
+      </w:r>
+      <w:r>
+        <w:t xml:space="preserve"> Medium |</w:t>
+      </w:r>
+    </w:p>
+    <w:p>
+      <w:r>
+        <w:t xml:space="preserve">| Phase 6: Build APK | Build scripts | 0 | </w:t>
+      </w:r>
+      <w:r>
+        <w:rPr>
+          <w:rFonts w:ascii="Segoe UI Emoji" w:hAnsi="Segoe UI Emoji" w:cs="Segoe UI Emoji"/>
+        </w:rPr>
+        <w:t>🟢</w:t>
+      </w:r>
+      <w:r>
+        <w:t xml:space="preserve"> Final |</w:t>
+      </w:r>
+    </w:p>
+    <w:p>
+      <w:r>
+        <w:t>| **Total** | **~41 files** | **3 new files** | |</w:t>
+      </w:r>
+    </w:p>
+    <w:p/>
+    <w:p>
+      <w:r>
+        <w:t>---</w:t>
+      </w:r>
+    </w:p>
+    <w:p/>
+    <w:p>
+      <w:r>
+        <w:t>## Verification Plan</w:t>
+      </w:r>
+    </w:p>
+    <w:p/>
+    <w:p>
+      <w:r>
+        <w:t>### Core Journey Test (Phase 1)</w:t>
+      </w:r>
+    </w:p>
+    <w:p>
+      <w:r>
+        <w:t>1. Open app → Login (OTP or mock)</w:t>
+      </w:r>
+    </w:p>
+    <w:p>
+      <w:r>
+        <w:t>2. Browse shops on directory (real API data loads)</w:t>
+      </w:r>
+    </w:p>
+    <w:p>
+      <w:r>
+        <w:t>3. Tap a shop → See real products from database</w:t>
+      </w:r>
+    </w:p>
+    <w:p>
+      <w:r>
+        <w:t xml:space="preserve">4. Add items to cart → Cart count updates on </w:t>
+      </w:r>
+      <w:proofErr w:type="spellStart"/>
+      <w:r>
+        <w:t>FloatingCheckoutBar</w:t>
+      </w:r>
+      <w:proofErr w:type="spellEnd"/>
+    </w:p>
+    <w:p>
+      <w:r>
+        <w:t>5. Go to checkout → See real cart items and total</w:t>
+      </w:r>
+    </w:p>
+    <w:p>
+      <w:r>
+        <w:t>6. Complete payment → Navigate to tracking</w:t>
+      </w:r>
+    </w:p>
+    <w:p>
+      <w:r>
+        <w:t>7. Verify socket.io connects for real-time updates</w:t>
+      </w:r>
+    </w:p>
+    <w:p/>
+    <w:p>
+      <w:r>
+        <w:t>### Module Screen Test (Phase 2-3)</w:t>
+      </w:r>
+    </w:p>
+    <w:p>
+      <w:r>
+        <w:t>- Open each module screen and verify:</w:t>
+      </w:r>
+    </w:p>
+    <w:p>
+      <w:r>
+        <w:t xml:space="preserve">  - Data loads from API (or shows `[DEMO]` badge with mock data)</w:t>
+      </w:r>
+    </w:p>
+    <w:p>
+      <w:r>
+        <w:t xml:space="preserve">  - No blank screens or crashes</w:t>
+      </w:r>
+    </w:p>
+    <w:p>
+      <w:r>
+        <w:t xml:space="preserve">  - Navigation works correctly</w:t>
+      </w:r>
+    </w:p>
+    <w:p/>
+    <w:p>
+      <w:r>
+        <w:t>### Mock Environment Test (Phase 4)</w:t>
+      </w:r>
+    </w:p>
+    <w:p>
+      <w:r>
+        <w:lastRenderedPageBreak/>
+        <w:t>- Disconnect backend → Verify app still works with mock data</w:t>
+      </w:r>
+    </w:p>
+    <w:p>
+      <w:r>
+        <w:t xml:space="preserve">- Verify </w:t>
+      </w:r>
+      <w:proofErr w:type="gramStart"/>
+      <w:r>
+        <w:t>`[</w:t>
+      </w:r>
+      <w:proofErr w:type="gramEnd"/>
+      <w:r>
+        <w:t>DEMO DATA]` badge appears on all mock screens</w:t>
+      </w:r>
+    </w:p>
+    <w:p>
+      <w:r>
+        <w:t xml:space="preserve">- Verify mock login shows </w:t>
+      </w:r>
+      <w:proofErr w:type="gramStart"/>
+      <w:r>
+        <w:t>`[</w:t>
+      </w:r>
+      <w:proofErr w:type="gramEnd"/>
+      <w:r>
+        <w:t>DEV MODE]` indicator</w:t>
+      </w:r>
+      <w:r>
+        <w:t xml:space="preserve">              </w:t>
+      </w:r>
+      <w:r>
+        <w:t xml:space="preserve">          </w:t>
       </w:r>
     </w:p>
     <w:sectPr>

</xml_diff>